<commit_message>
feat: validasi nama & telepon, fitur edit nama user, update dokumen laporan & screenshot
</commit_message>
<xml_diff>
--- a/ARTVAEL VICTOR SAHETAPY_JUNIOR WEB DEVELOPER/03_LAPORAN/LAPORAN UJI KOMPETENSI KEAHLIAN.docx
+++ b/ARTVAEL VICTOR SAHETAPY_JUNIOR WEB DEVELOPER/03_LAPORAN/LAPORAN UJI KOMPETENSI KEAHLIAN.docx
@@ -425,49 +425,20 @@
       <w:tr>
         <w:tc>
           <w:tcPr>
-            <w:tcW w:type="dxa" w:w="7920"/>
-            <w:tcBorders>
-              <w:top w:val="none"/>
-              <w:left w:val="none"/>
-              <w:bottom w:val="none"/>
-              <w:right w:val="none"/>
-            </w:tcBorders>
-          </w:tcPr>
-          <w:p>
-            <w:pPr>
-              <w:spacing w:before="40" w:after="40" w:line="276" w:lineRule="auto"/>
-            </w:pPr>
-            <w:r>
-              <w:rPr>
-                <w:rFonts w:ascii="Calibri" w:hAnsi="Calibri"/>
-                <w:b/>
-                <w:sz w:val="21"/>
-              </w:rPr>
+            <w:tcW w:type="dxa" w:w="4802"/>
+          </w:tcPr>
+          <w:p>
+            <w:r>
               <w:t>1. COVER &amp; IDENTITAS ASESI</w:t>
             </w:r>
           </w:p>
         </w:tc>
         <w:tc>
           <w:tcPr>
-            <w:tcW w:type="dxa" w:w="1440"/>
-            <w:tcBorders>
-              <w:top w:val="none"/>
-              <w:left w:val="none"/>
-              <w:bottom w:val="none"/>
-              <w:right w:val="none"/>
-            </w:tcBorders>
-          </w:tcPr>
-          <w:p>
-            <w:pPr>
-              <w:spacing w:before="40" w:after="40" w:line="276" w:lineRule="auto"/>
-              <w:jc w:val="right"/>
-            </w:pPr>
-            <w:r>
-              <w:rPr>
-                <w:rFonts w:ascii="Calibri" w:hAnsi="Calibri"/>
-                <w:b/>
-                <w:sz w:val="21"/>
-              </w:rPr>
+            <w:tcW w:type="dxa" w:w="4802"/>
+          </w:tcPr>
+          <w:p>
+            <w:r>
               <w:t>Hal. 1</w:t>
             </w:r>
           </w:p>
@@ -476,49 +447,20 @@
       <w:tr>
         <w:tc>
           <w:tcPr>
-            <w:tcW w:type="dxa" w:w="7920"/>
-            <w:tcBorders>
-              <w:top w:val="none"/>
-              <w:left w:val="none"/>
-              <w:bottom w:val="none"/>
-              <w:right w:val="none"/>
-            </w:tcBorders>
-          </w:tcPr>
-          <w:p>
-            <w:pPr>
-              <w:spacing w:before="40" w:after="40" w:line="276" w:lineRule="auto"/>
-            </w:pPr>
-            <w:r>
-              <w:rPr>
-                <w:rFonts w:ascii="Calibri" w:hAnsi="Calibri"/>
-                <w:b/>
-                <w:sz w:val="21"/>
-              </w:rPr>
+            <w:tcW w:type="dxa" w:w="4802"/>
+          </w:tcPr>
+          <w:p>
+            <w:r>
               <w:t>DAFTAR ISI</w:t>
             </w:r>
           </w:p>
         </w:tc>
         <w:tc>
           <w:tcPr>
-            <w:tcW w:type="dxa" w:w="1440"/>
-            <w:tcBorders>
-              <w:top w:val="none"/>
-              <w:left w:val="none"/>
-              <w:bottom w:val="none"/>
-              <w:right w:val="none"/>
-            </w:tcBorders>
-          </w:tcPr>
-          <w:p>
-            <w:pPr>
-              <w:spacing w:before="40" w:after="40" w:line="276" w:lineRule="auto"/>
-              <w:jc w:val="right"/>
-            </w:pPr>
-            <w:r>
-              <w:rPr>
-                <w:rFonts w:ascii="Calibri" w:hAnsi="Calibri"/>
-                <w:b/>
-                <w:sz w:val="21"/>
-              </w:rPr>
+            <w:tcW w:type="dxa" w:w="4802"/>
+          </w:tcPr>
+          <w:p>
+            <w:r>
               <w:t>Hal. 2</w:t>
             </w:r>
           </w:p>
@@ -527,49 +469,20 @@
       <w:tr>
         <w:tc>
           <w:tcPr>
-            <w:tcW w:type="dxa" w:w="7920"/>
-            <w:tcBorders>
-              <w:top w:val="none"/>
-              <w:left w:val="none"/>
-              <w:bottom w:val="none"/>
-              <w:right w:val="none"/>
-            </w:tcBorders>
-          </w:tcPr>
-          <w:p>
-            <w:pPr>
-              <w:spacing w:before="40" w:after="40" w:line="276" w:lineRule="auto"/>
-            </w:pPr>
-            <w:r>
-              <w:rPr>
-                <w:rFonts w:ascii="Calibri" w:hAnsi="Calibri"/>
-                <w:b/>
-                <w:sz w:val="21"/>
-              </w:rPr>
+            <w:tcW w:type="dxa" w:w="4802"/>
+          </w:tcPr>
+          <w:p>
+            <w:r>
               <w:t>2. DESKRIPSI SINGKAT APLIKASI DAN TUJUAN</w:t>
             </w:r>
           </w:p>
         </w:tc>
         <w:tc>
           <w:tcPr>
-            <w:tcW w:type="dxa" w:w="1440"/>
-            <w:tcBorders>
-              <w:top w:val="none"/>
-              <w:left w:val="none"/>
-              <w:bottom w:val="none"/>
-              <w:right w:val="none"/>
-            </w:tcBorders>
-          </w:tcPr>
-          <w:p>
-            <w:pPr>
-              <w:spacing w:before="40" w:after="40" w:line="276" w:lineRule="auto"/>
-              <w:jc w:val="right"/>
-            </w:pPr>
-            <w:r>
-              <w:rPr>
-                <w:rFonts w:ascii="Calibri" w:hAnsi="Calibri"/>
-                <w:b/>
-                <w:sz w:val="21"/>
-              </w:rPr>
+            <w:tcW w:type="dxa" w:w="4802"/>
+          </w:tcPr>
+          <w:p>
+            <w:r>
               <w:t>Hal. 3</w:t>
             </w:r>
           </w:p>
@@ -578,49 +491,20 @@
       <w:tr>
         <w:tc>
           <w:tcPr>
-            <w:tcW w:type="dxa" w:w="7920"/>
-            <w:tcBorders>
-              <w:top w:val="none"/>
-              <w:left w:val="none"/>
-              <w:bottom w:val="none"/>
-              <w:right w:val="none"/>
-            </w:tcBorders>
-          </w:tcPr>
-          <w:p>
-            <w:pPr>
-              <w:spacing w:before="40" w:after="40" w:line="276" w:lineRule="auto"/>
-            </w:pPr>
-            <w:r>
-              <w:rPr>
-                <w:rFonts w:ascii="Calibri" w:hAnsi="Calibri"/>
-                <w:b w:val="0"/>
-                <w:sz w:val="21"/>
-              </w:rPr>
-              <w:t xml:space="preserve">   2.1 Deskripsi Singkat Aplikasi</w:t>
-            </w:r>
-          </w:p>
-        </w:tc>
-        <w:tc>
-          <w:tcPr>
-            <w:tcW w:type="dxa" w:w="1440"/>
-            <w:tcBorders>
-              <w:top w:val="none"/>
-              <w:left w:val="none"/>
-              <w:bottom w:val="none"/>
-              <w:right w:val="none"/>
-            </w:tcBorders>
-          </w:tcPr>
-          <w:p>
-            <w:pPr>
-              <w:spacing w:before="40" w:after="40" w:line="276" w:lineRule="auto"/>
-              <w:jc w:val="right"/>
-            </w:pPr>
-            <w:r>
-              <w:rPr>
-                <w:rFonts w:ascii="Calibri" w:hAnsi="Calibri"/>
-                <w:b w:val="0"/>
-                <w:sz w:val="21"/>
-              </w:rPr>
+            <w:tcW w:type="dxa" w:w="4802"/>
+          </w:tcPr>
+          <w:p>
+            <w:r>
+              <w:t>2.1 Deskripsi Singkat Aplikasi</w:t>
+            </w:r>
+          </w:p>
+        </w:tc>
+        <w:tc>
+          <w:tcPr>
+            <w:tcW w:type="dxa" w:w="4802"/>
+          </w:tcPr>
+          <w:p>
+            <w:r>
               <w:t>Hal. 3</w:t>
             </w:r>
           </w:p>
@@ -629,49 +513,20 @@
       <w:tr>
         <w:tc>
           <w:tcPr>
-            <w:tcW w:type="dxa" w:w="7920"/>
-            <w:tcBorders>
-              <w:top w:val="none"/>
-              <w:left w:val="none"/>
-              <w:bottom w:val="none"/>
-              <w:right w:val="none"/>
-            </w:tcBorders>
-          </w:tcPr>
-          <w:p>
-            <w:pPr>
-              <w:spacing w:before="40" w:after="40" w:line="276" w:lineRule="auto"/>
-            </w:pPr>
-            <w:r>
-              <w:rPr>
-                <w:rFonts w:ascii="Calibri" w:hAnsi="Calibri"/>
-                <w:b w:val="0"/>
-                <w:sz w:val="21"/>
-              </w:rPr>
-              <w:t xml:space="preserve">   2.2 Tujuan Aplikasi</w:t>
-            </w:r>
-          </w:p>
-        </w:tc>
-        <w:tc>
-          <w:tcPr>
-            <w:tcW w:type="dxa" w:w="1440"/>
-            <w:tcBorders>
-              <w:top w:val="none"/>
-              <w:left w:val="none"/>
-              <w:bottom w:val="none"/>
-              <w:right w:val="none"/>
-            </w:tcBorders>
-          </w:tcPr>
-          <w:p>
-            <w:pPr>
-              <w:spacing w:before="40" w:after="40" w:line="276" w:lineRule="auto"/>
-              <w:jc w:val="right"/>
-            </w:pPr>
-            <w:r>
-              <w:rPr>
-                <w:rFonts w:ascii="Calibri" w:hAnsi="Calibri"/>
-                <w:b w:val="0"/>
-                <w:sz w:val="21"/>
-              </w:rPr>
+            <w:tcW w:type="dxa" w:w="4802"/>
+          </w:tcPr>
+          <w:p>
+            <w:r>
+              <w:t>2.2 Tujuan Aplikasi</w:t>
+            </w:r>
+          </w:p>
+        </w:tc>
+        <w:tc>
+          <w:tcPr>
+            <w:tcW w:type="dxa" w:w="4802"/>
+          </w:tcPr>
+          <w:p>
+            <w:r>
               <w:t>Hal. 3</w:t>
             </w:r>
           </w:p>
@@ -680,49 +535,20 @@
       <w:tr>
         <w:tc>
           <w:tcPr>
-            <w:tcW w:type="dxa" w:w="7920"/>
-            <w:tcBorders>
-              <w:top w:val="none"/>
-              <w:left w:val="none"/>
-              <w:bottom w:val="none"/>
-              <w:right w:val="none"/>
-            </w:tcBorders>
-          </w:tcPr>
-          <w:p>
-            <w:pPr>
-              <w:spacing w:before="40" w:after="40" w:line="276" w:lineRule="auto"/>
-            </w:pPr>
-            <w:r>
-              <w:rPr>
-                <w:rFonts w:ascii="Calibri" w:hAnsi="Calibri"/>
-                <w:b/>
-                <w:sz w:val="21"/>
-              </w:rPr>
+            <w:tcW w:type="dxa" w:w="4802"/>
+          </w:tcPr>
+          <w:p>
+            <w:r>
               <w:t>3. TEKNOLOGI YANG DIGUNAKAN</w:t>
             </w:r>
           </w:p>
         </w:tc>
         <w:tc>
           <w:tcPr>
-            <w:tcW w:type="dxa" w:w="1440"/>
-            <w:tcBorders>
-              <w:top w:val="none"/>
-              <w:left w:val="none"/>
-              <w:bottom w:val="none"/>
-              <w:right w:val="none"/>
-            </w:tcBorders>
-          </w:tcPr>
-          <w:p>
-            <w:pPr>
-              <w:spacing w:before="40" w:after="40" w:line="276" w:lineRule="auto"/>
-              <w:jc w:val="right"/>
-            </w:pPr>
-            <w:r>
-              <w:rPr>
-                <w:rFonts w:ascii="Calibri" w:hAnsi="Calibri"/>
-                <w:b/>
-                <w:sz w:val="21"/>
-              </w:rPr>
+            <w:tcW w:type="dxa" w:w="4802"/>
+          </w:tcPr>
+          <w:p>
+            <w:r>
               <w:t>Hal. 4</w:t>
             </w:r>
           </w:p>
@@ -731,49 +557,20 @@
       <w:tr>
         <w:tc>
           <w:tcPr>
-            <w:tcW w:type="dxa" w:w="7920"/>
-            <w:tcBorders>
-              <w:top w:val="none"/>
-              <w:left w:val="none"/>
-              <w:bottom w:val="none"/>
-              <w:right w:val="none"/>
-            </w:tcBorders>
-          </w:tcPr>
-          <w:p>
-            <w:pPr>
-              <w:spacing w:before="40" w:after="40" w:line="276" w:lineRule="auto"/>
-            </w:pPr>
-            <w:r>
-              <w:rPr>
-                <w:rFonts w:ascii="Calibri" w:hAnsi="Calibri"/>
-                <w:b/>
-                <w:sz w:val="21"/>
-              </w:rPr>
+            <w:tcW w:type="dxa" w:w="4802"/>
+          </w:tcPr>
+          <w:p>
+            <w:r>
               <w:t>4. PERANCANGAN APLIKASI</w:t>
             </w:r>
           </w:p>
         </w:tc>
         <w:tc>
           <w:tcPr>
-            <w:tcW w:type="dxa" w:w="1440"/>
-            <w:tcBorders>
-              <w:top w:val="none"/>
-              <w:left w:val="none"/>
-              <w:bottom w:val="none"/>
-              <w:right w:val="none"/>
-            </w:tcBorders>
-          </w:tcPr>
-          <w:p>
-            <w:pPr>
-              <w:spacing w:before="40" w:after="40" w:line="276" w:lineRule="auto"/>
-              <w:jc w:val="right"/>
-            </w:pPr>
-            <w:r>
-              <w:rPr>
-                <w:rFonts w:ascii="Calibri" w:hAnsi="Calibri"/>
-                <w:b/>
-                <w:sz w:val="21"/>
-              </w:rPr>
+            <w:tcW w:type="dxa" w:w="4802"/>
+          </w:tcPr>
+          <w:p>
+            <w:r>
               <w:t>Hal. 4</w:t>
             </w:r>
           </w:p>
@@ -782,49 +579,20 @@
       <w:tr>
         <w:tc>
           <w:tcPr>
-            <w:tcW w:type="dxa" w:w="7920"/>
-            <w:tcBorders>
-              <w:top w:val="none"/>
-              <w:left w:val="none"/>
-              <w:bottom w:val="none"/>
-              <w:right w:val="none"/>
-            </w:tcBorders>
-          </w:tcPr>
-          <w:p>
-            <w:pPr>
-              <w:spacing w:before="40" w:after="40" w:line="276" w:lineRule="auto"/>
-            </w:pPr>
-            <w:r>
-              <w:rPr>
-                <w:rFonts w:ascii="Calibri" w:hAnsi="Calibri"/>
-                <w:b w:val="0"/>
-                <w:sz w:val="21"/>
-              </w:rPr>
-              <w:t xml:space="preserve">   4.1 Alur Aplikasi (Flowchart Logic)</w:t>
-            </w:r>
-          </w:p>
-        </w:tc>
-        <w:tc>
-          <w:tcPr>
-            <w:tcW w:type="dxa" w:w="1440"/>
-            <w:tcBorders>
-              <w:top w:val="none"/>
-              <w:left w:val="none"/>
-              <w:bottom w:val="none"/>
-              <w:right w:val="none"/>
-            </w:tcBorders>
-          </w:tcPr>
-          <w:p>
-            <w:pPr>
-              <w:spacing w:before="40" w:after="40" w:line="276" w:lineRule="auto"/>
-              <w:jc w:val="right"/>
-            </w:pPr>
-            <w:r>
-              <w:rPr>
-                <w:rFonts w:ascii="Calibri" w:hAnsi="Calibri"/>
-                <w:b w:val="0"/>
-                <w:sz w:val="21"/>
-              </w:rPr>
+            <w:tcW w:type="dxa" w:w="4802"/>
+          </w:tcPr>
+          <w:p>
+            <w:r>
+              <w:t>4.1 Alur Aplikasi (Flowchart Logic)</w:t>
+            </w:r>
+          </w:p>
+        </w:tc>
+        <w:tc>
+          <w:tcPr>
+            <w:tcW w:type="dxa" w:w="4802"/>
+          </w:tcPr>
+          <w:p>
+            <w:r>
               <w:t>Hal. 4</w:t>
             </w:r>
           </w:p>
@@ -833,49 +601,20 @@
       <w:tr>
         <w:tc>
           <w:tcPr>
-            <w:tcW w:type="dxa" w:w="7920"/>
-            <w:tcBorders>
-              <w:top w:val="none"/>
-              <w:left w:val="none"/>
-              <w:bottom w:val="none"/>
-              <w:right w:val="none"/>
-            </w:tcBorders>
-          </w:tcPr>
-          <w:p>
-            <w:pPr>
-              <w:spacing w:before="40" w:after="40" w:line="276" w:lineRule="auto"/>
-            </w:pPr>
-            <w:r>
-              <w:rPr>
-                <w:rFonts w:ascii="Calibri" w:hAnsi="Calibri"/>
-                <w:b w:val="0"/>
-                <w:sz w:val="21"/>
-              </w:rPr>
-              <w:t xml:space="preserve">   4.2 Struktur Menu &amp; Navigasi Antarmuka</w:t>
-            </w:r>
-          </w:p>
-        </w:tc>
-        <w:tc>
-          <w:tcPr>
-            <w:tcW w:type="dxa" w:w="1440"/>
-            <w:tcBorders>
-              <w:top w:val="none"/>
-              <w:left w:val="none"/>
-              <w:bottom w:val="none"/>
-              <w:right w:val="none"/>
-            </w:tcBorders>
-          </w:tcPr>
-          <w:p>
-            <w:pPr>
-              <w:spacing w:before="40" w:after="40" w:line="276" w:lineRule="auto"/>
-              <w:jc w:val="right"/>
-            </w:pPr>
-            <w:r>
-              <w:rPr>
-                <w:rFonts w:ascii="Calibri" w:hAnsi="Calibri"/>
-                <w:b w:val="0"/>
-                <w:sz w:val="21"/>
-              </w:rPr>
+            <w:tcW w:type="dxa" w:w="4802"/>
+          </w:tcPr>
+          <w:p>
+            <w:r>
+              <w:t>4.2 Struktur Menu &amp; Navigasi Antarmuka</w:t>
+            </w:r>
+          </w:p>
+        </w:tc>
+        <w:tc>
+          <w:tcPr>
+            <w:tcW w:type="dxa" w:w="4802"/>
+          </w:tcPr>
+          <w:p>
+            <w:r>
               <w:t>Hal. 4</w:t>
             </w:r>
           </w:p>
@@ -884,49 +623,20 @@
       <w:tr>
         <w:tc>
           <w:tcPr>
-            <w:tcW w:type="dxa" w:w="7920"/>
-            <w:tcBorders>
-              <w:top w:val="none"/>
-              <w:left w:val="none"/>
-              <w:bottom w:val="none"/>
-              <w:right w:val="none"/>
-            </w:tcBorders>
-          </w:tcPr>
-          <w:p>
-            <w:pPr>
-              <w:spacing w:before="40" w:after="40" w:line="276" w:lineRule="auto"/>
-            </w:pPr>
-            <w:r>
-              <w:rPr>
-                <w:rFonts w:ascii="Calibri" w:hAnsi="Calibri"/>
-                <w:b w:val="0"/>
-                <w:sz w:val="21"/>
-              </w:rPr>
-              <w:t xml:space="preserve">   4.3 Rancangan &amp; Relasi Database (Schema &amp; Relationship)</w:t>
-            </w:r>
-          </w:p>
-        </w:tc>
-        <w:tc>
-          <w:tcPr>
-            <w:tcW w:type="dxa" w:w="1440"/>
-            <w:tcBorders>
-              <w:top w:val="none"/>
-              <w:left w:val="none"/>
-              <w:bottom w:val="none"/>
-              <w:right w:val="none"/>
-            </w:tcBorders>
-          </w:tcPr>
-          <w:p>
-            <w:pPr>
-              <w:spacing w:before="40" w:after="40" w:line="276" w:lineRule="auto"/>
-              <w:jc w:val="right"/>
-            </w:pPr>
-            <w:r>
-              <w:rPr>
-                <w:rFonts w:ascii="Calibri" w:hAnsi="Calibri"/>
-                <w:b w:val="0"/>
-                <w:sz w:val="21"/>
-              </w:rPr>
+            <w:tcW w:type="dxa" w:w="4802"/>
+          </w:tcPr>
+          <w:p>
+            <w:r>
+              <w:t>4.3 Rancangan &amp; Relasi Database (Schema &amp; Relationship)</w:t>
+            </w:r>
+          </w:p>
+        </w:tc>
+        <w:tc>
+          <w:tcPr>
+            <w:tcW w:type="dxa" w:w="4802"/>
+          </w:tcPr>
+          <w:p>
+            <w:r>
               <w:t>Hal. 5</w:t>
             </w:r>
           </w:p>
@@ -935,49 +645,20 @@
       <w:tr>
         <w:tc>
           <w:tcPr>
-            <w:tcW w:type="dxa" w:w="7920"/>
-            <w:tcBorders>
-              <w:top w:val="none"/>
-              <w:left w:val="none"/>
-              <w:bottom w:val="none"/>
-              <w:right w:val="none"/>
-            </w:tcBorders>
-          </w:tcPr>
-          <w:p>
-            <w:pPr>
-              <w:spacing w:before="40" w:after="40" w:line="276" w:lineRule="auto"/>
-            </w:pPr>
-            <w:r>
-              <w:rPr>
-                <w:rFonts w:ascii="Calibri" w:hAnsi="Calibri"/>
-                <w:b w:val="0"/>
-                <w:sz w:val="21"/>
-              </w:rPr>
-              <w:t xml:space="preserve">   4.4 Struktur File &amp; Folder Program</w:t>
-            </w:r>
-          </w:p>
-        </w:tc>
-        <w:tc>
-          <w:tcPr>
-            <w:tcW w:type="dxa" w:w="1440"/>
-            <w:tcBorders>
-              <w:top w:val="none"/>
-              <w:left w:val="none"/>
-              <w:bottom w:val="none"/>
-              <w:right w:val="none"/>
-            </w:tcBorders>
-          </w:tcPr>
-          <w:p>
-            <w:pPr>
-              <w:spacing w:before="40" w:after="40" w:line="276" w:lineRule="auto"/>
-              <w:jc w:val="right"/>
-            </w:pPr>
-            <w:r>
-              <w:rPr>
-                <w:rFonts w:ascii="Calibri" w:hAnsi="Calibri"/>
-                <w:b w:val="0"/>
-                <w:sz w:val="21"/>
-              </w:rPr>
+            <w:tcW w:type="dxa" w:w="4802"/>
+          </w:tcPr>
+          <w:p>
+            <w:r>
+              <w:t>4.4 Struktur File &amp; Folder Program</w:t>
+            </w:r>
+          </w:p>
+        </w:tc>
+        <w:tc>
+          <w:tcPr>
+            <w:tcW w:type="dxa" w:w="4802"/>
+          </w:tcPr>
+          <w:p>
+            <w:r>
               <w:t>Hal. 6</w:t>
             </w:r>
           </w:p>
@@ -986,49 +667,20 @@
       <w:tr>
         <w:tc>
           <w:tcPr>
-            <w:tcW w:type="dxa" w:w="7920"/>
-            <w:tcBorders>
-              <w:top w:val="none"/>
-              <w:left w:val="none"/>
-              <w:bottom w:val="none"/>
-              <w:right w:val="none"/>
-            </w:tcBorders>
-          </w:tcPr>
-          <w:p>
-            <w:pPr>
-              <w:spacing w:before="40" w:after="40" w:line="276" w:lineRule="auto"/>
-            </w:pPr>
-            <w:r>
-              <w:rPr>
-                <w:rFonts w:ascii="Calibri" w:hAnsi="Calibri"/>
-                <w:b/>
-                <w:sz w:val="21"/>
-              </w:rPr>
+            <w:tcW w:type="dxa" w:w="4802"/>
+          </w:tcPr>
+          <w:p>
+            <w:r>
               <w:t>5. IMPLEMENTASI PROGRAM &amp; BUKTI SCREENSHOT</w:t>
             </w:r>
           </w:p>
         </w:tc>
         <w:tc>
           <w:tcPr>
-            <w:tcW w:type="dxa" w:w="1440"/>
-            <w:tcBorders>
-              <w:top w:val="none"/>
-              <w:left w:val="none"/>
-              <w:bottom w:val="none"/>
-              <w:right w:val="none"/>
-            </w:tcBorders>
-          </w:tcPr>
-          <w:p>
-            <w:pPr>
-              <w:spacing w:before="40" w:after="40" w:line="276" w:lineRule="auto"/>
-              <w:jc w:val="right"/>
-            </w:pPr>
-            <w:r>
-              <w:rPr>
-                <w:rFonts w:ascii="Calibri" w:hAnsi="Calibri"/>
-                <w:b/>
-                <w:sz w:val="21"/>
-              </w:rPr>
+            <w:tcW w:type="dxa" w:w="4802"/>
+          </w:tcPr>
+          <w:p>
+            <w:r>
               <w:t>Hal. 7</w:t>
             </w:r>
           </w:p>
@@ -1037,49 +689,20 @@
       <w:tr>
         <w:tc>
           <w:tcPr>
-            <w:tcW w:type="dxa" w:w="7920"/>
-            <w:tcBorders>
-              <w:top w:val="none"/>
-              <w:left w:val="none"/>
-              <w:bottom w:val="none"/>
-              <w:right w:val="none"/>
-            </w:tcBorders>
-          </w:tcPr>
-          <w:p>
-            <w:pPr>
-              <w:spacing w:before="40" w:after="40" w:line="276" w:lineRule="auto"/>
-            </w:pPr>
-            <w:r>
-              <w:rPr>
-                <w:rFonts w:ascii="Calibri" w:hAnsi="Calibri"/>
-                <w:b w:val="0"/>
-                <w:sz w:val="21"/>
-              </w:rPr>
-              <w:t xml:space="preserve">   5.1 Halaman Login &amp; Proteksi Keamanan Autentikasi</w:t>
-            </w:r>
-          </w:p>
-        </w:tc>
-        <w:tc>
-          <w:tcPr>
-            <w:tcW w:type="dxa" w:w="1440"/>
-            <w:tcBorders>
-              <w:top w:val="none"/>
-              <w:left w:val="none"/>
-              <w:bottom w:val="none"/>
-              <w:right w:val="none"/>
-            </w:tcBorders>
-          </w:tcPr>
-          <w:p>
-            <w:pPr>
-              <w:spacing w:before="40" w:after="40" w:line="276" w:lineRule="auto"/>
-              <w:jc w:val="right"/>
-            </w:pPr>
-            <w:r>
-              <w:rPr>
-                <w:rFonts w:ascii="Calibri" w:hAnsi="Calibri"/>
-                <w:b w:val="0"/>
-                <w:sz w:val="21"/>
-              </w:rPr>
+            <w:tcW w:type="dxa" w:w="4802"/>
+          </w:tcPr>
+          <w:p>
+            <w:r>
+              <w:t>5.1 Halaman Depan / Landing Page (Selamat Datang)</w:t>
+            </w:r>
+          </w:p>
+        </w:tc>
+        <w:tc>
+          <w:tcPr>
+            <w:tcW w:type="dxa" w:w="4802"/>
+          </w:tcPr>
+          <w:p>
+            <w:r>
               <w:t>Hal. 7</w:t>
             </w:r>
           </w:p>
@@ -1088,49 +711,20 @@
       <w:tr>
         <w:tc>
           <w:tcPr>
-            <w:tcW w:type="dxa" w:w="7920"/>
-            <w:tcBorders>
-              <w:top w:val="none"/>
-              <w:left w:val="none"/>
-              <w:bottom w:val="none"/>
-              <w:right w:val="none"/>
-            </w:tcBorders>
-          </w:tcPr>
-          <w:p>
-            <w:pPr>
-              <w:spacing w:before="40" w:after="40" w:line="276" w:lineRule="auto"/>
-            </w:pPr>
-            <w:r>
-              <w:rPr>
-                <w:rFonts w:ascii="Calibri" w:hAnsi="Calibri"/>
-                <w:b w:val="0"/>
-                <w:sz w:val="21"/>
-              </w:rPr>
-              <w:t xml:space="preserve">   5.2 Tampilan Dashboard Administrator</w:t>
-            </w:r>
-          </w:p>
-        </w:tc>
-        <w:tc>
-          <w:tcPr>
-            <w:tcW w:type="dxa" w:w="1440"/>
-            <w:tcBorders>
-              <w:top w:val="none"/>
-              <w:left w:val="none"/>
-              <w:bottom w:val="none"/>
-              <w:right w:val="none"/>
-            </w:tcBorders>
-          </w:tcPr>
-          <w:p>
-            <w:pPr>
-              <w:spacing w:before="40" w:after="40" w:line="276" w:lineRule="auto"/>
-              <w:jc w:val="right"/>
-            </w:pPr>
-            <w:r>
-              <w:rPr>
-                <w:rFonts w:ascii="Calibri" w:hAnsi="Calibri"/>
-                <w:b w:val="0"/>
-                <w:sz w:val="21"/>
-              </w:rPr>
+            <w:tcW w:type="dxa" w:w="4802"/>
+          </w:tcPr>
+          <w:p>
+            <w:r>
+              <w:t>5.2 Halaman Registrasi Akun Peserta Baru</w:t>
+            </w:r>
+          </w:p>
+        </w:tc>
+        <w:tc>
+          <w:tcPr>
+            <w:tcW w:type="dxa" w:w="4802"/>
+          </w:tcPr>
+          <w:p>
+            <w:r>
               <w:t>Hal. 7</w:t>
             </w:r>
           </w:p>
@@ -1139,49 +733,20 @@
       <w:tr>
         <w:tc>
           <w:tcPr>
-            <w:tcW w:type="dxa" w:w="7920"/>
-            <w:tcBorders>
-              <w:top w:val="none"/>
-              <w:left w:val="none"/>
-              <w:bottom w:val="none"/>
-              <w:right w:val="none"/>
-            </w:tcBorders>
-          </w:tcPr>
-          <w:p>
-            <w:pPr>
-              <w:spacing w:before="40" w:after="40" w:line="276" w:lineRule="auto"/>
-            </w:pPr>
-            <w:r>
-              <w:rPr>
-                <w:rFonts w:ascii="Calibri" w:hAnsi="Calibri"/>
-                <w:b w:val="0"/>
-                <w:sz w:val="21"/>
-              </w:rPr>
-              <w:t xml:space="preserve">   5.3 Pengelolaan Data Peserta &amp; Validasi Form Input</w:t>
-            </w:r>
-          </w:p>
-        </w:tc>
-        <w:tc>
-          <w:tcPr>
-            <w:tcW w:type="dxa" w:w="1440"/>
-            <w:tcBorders>
-              <w:top w:val="none"/>
-              <w:left w:val="none"/>
-              <w:bottom w:val="none"/>
-              <w:right w:val="none"/>
-            </w:tcBorders>
-          </w:tcPr>
-          <w:p>
-            <w:pPr>
-              <w:spacing w:before="40" w:after="40" w:line="276" w:lineRule="auto"/>
-              <w:jc w:val="right"/>
-            </w:pPr>
-            <w:r>
-              <w:rPr>
-                <w:rFonts w:ascii="Calibri" w:hAnsi="Calibri"/>
-                <w:b w:val="0"/>
-                <w:sz w:val="21"/>
-              </w:rPr>
+            <w:tcW w:type="dxa" w:w="4802"/>
+          </w:tcPr>
+          <w:p>
+            <w:r>
+              <w:t>5.3 Halaman Login Multi-Role &amp; Proteksi Keamanan Autentikasi</w:t>
+            </w:r>
+          </w:p>
+        </w:tc>
+        <w:tc>
+          <w:tcPr>
+            <w:tcW w:type="dxa" w:w="4802"/>
+          </w:tcPr>
+          <w:p>
+            <w:r>
               <w:t>Hal. 8</w:t>
             </w:r>
           </w:p>
@@ -1190,50 +755,21 @@
       <w:tr>
         <w:tc>
           <w:tcPr>
-            <w:tcW w:type="dxa" w:w="7920"/>
-            <w:tcBorders>
-              <w:top w:val="none"/>
-              <w:left w:val="none"/>
-              <w:bottom w:val="none"/>
-              <w:right w:val="none"/>
-            </w:tcBorders>
-          </w:tcPr>
-          <w:p>
-            <w:pPr>
-              <w:spacing w:before="40" w:after="40" w:line="276" w:lineRule="auto"/>
-            </w:pPr>
-            <w:r>
-              <w:rPr>
-                <w:rFonts w:ascii="Calibri" w:hAnsi="Calibri"/>
-                <w:b w:val="0"/>
-                <w:sz w:val="21"/>
-              </w:rPr>
-              <w:t xml:space="preserve">   5.4 Fitur Pencarian Data Peserta &amp; Detail Data</w:t>
-            </w:r>
-          </w:p>
-        </w:tc>
-        <w:tc>
-          <w:tcPr>
-            <w:tcW w:type="dxa" w:w="1440"/>
-            <w:tcBorders>
-              <w:top w:val="none"/>
-              <w:left w:val="none"/>
-              <w:bottom w:val="none"/>
-              <w:right w:val="none"/>
-            </w:tcBorders>
-          </w:tcPr>
-          <w:p>
-            <w:pPr>
-              <w:spacing w:before="40" w:after="40" w:line="276" w:lineRule="auto"/>
-              <w:jc w:val="right"/>
-            </w:pPr>
-            <w:r>
-              <w:rPr>
-                <w:rFonts w:ascii="Calibri" w:hAnsi="Calibri"/>
-                <w:b w:val="0"/>
-                <w:sz w:val="21"/>
-              </w:rPr>
-              <w:t>Hal. 9</w:t>
+            <w:tcW w:type="dxa" w:w="4802"/>
+          </w:tcPr>
+          <w:p>
+            <w:r>
+              <w:t>5.4 Tampilan Dashboard Administrator</w:t>
+            </w:r>
+          </w:p>
+        </w:tc>
+        <w:tc>
+          <w:tcPr>
+            <w:tcW w:type="dxa" w:w="4802"/>
+          </w:tcPr>
+          <w:p>
+            <w:r>
+              <w:t>Hal. 8</w:t>
             </w:r>
           </w:p>
         </w:tc>
@@ -1241,50 +777,21 @@
       <w:tr>
         <w:tc>
           <w:tcPr>
-            <w:tcW w:type="dxa" w:w="7920"/>
-            <w:tcBorders>
-              <w:top w:val="none"/>
-              <w:left w:val="none"/>
-              <w:bottom w:val="none"/>
-              <w:right w:val="none"/>
-            </w:tcBorders>
-          </w:tcPr>
-          <w:p>
-            <w:pPr>
-              <w:spacing w:before="40" w:after="40" w:line="276" w:lineRule="auto"/>
-            </w:pPr>
-            <w:r>
-              <w:rPr>
-                <w:rFonts w:ascii="Calibri" w:hAnsi="Calibri"/>
-                <w:b w:val="0"/>
-                <w:sz w:val="21"/>
-              </w:rPr>
-              <w:t xml:space="preserve">   5.5 Fitur Ubah (Edit) dan Hapus (Delete) Data Peserta</w:t>
-            </w:r>
-          </w:p>
-        </w:tc>
-        <w:tc>
-          <w:tcPr>
-            <w:tcW w:type="dxa" w:w="1440"/>
-            <w:tcBorders>
-              <w:top w:val="none"/>
-              <w:left w:val="none"/>
-              <w:bottom w:val="none"/>
-              <w:right w:val="none"/>
-            </w:tcBorders>
-          </w:tcPr>
-          <w:p>
-            <w:pPr>
-              <w:spacing w:before="40" w:after="40" w:line="276" w:lineRule="auto"/>
-              <w:jc w:val="right"/>
-            </w:pPr>
-            <w:r>
-              <w:rPr>
-                <w:rFonts w:ascii="Calibri" w:hAnsi="Calibri"/>
-                <w:b w:val="0"/>
-                <w:sz w:val="21"/>
-              </w:rPr>
-              <w:t>Hal. 10</w:t>
+            <w:tcW w:type="dxa" w:w="4802"/>
+          </w:tcPr>
+          <w:p>
+            <w:r>
+              <w:t>5.5 Tampilan Dashboard Peserta (User)</w:t>
+            </w:r>
+          </w:p>
+        </w:tc>
+        <w:tc>
+          <w:tcPr>
+            <w:tcW w:type="dxa" w:w="4802"/>
+          </w:tcPr>
+          <w:p>
+            <w:r>
+              <w:t>Hal. 9</w:t>
             </w:r>
           </w:p>
         </w:tc>
@@ -1292,50 +799,21 @@
       <w:tr>
         <w:tc>
           <w:tcPr>
-            <w:tcW w:type="dxa" w:w="7920"/>
-            <w:tcBorders>
-              <w:top w:val="none"/>
-              <w:left w:val="none"/>
-              <w:bottom w:val="none"/>
-              <w:right w:val="none"/>
-            </w:tcBorders>
-          </w:tcPr>
-          <w:p>
-            <w:pPr>
-              <w:spacing w:before="40" w:after="40" w:line="276" w:lineRule="auto"/>
-            </w:pPr>
-            <w:r>
-              <w:rPr>
-                <w:rFonts w:ascii="Calibri" w:hAnsi="Calibri"/>
-                <w:b w:val="0"/>
-                <w:sz w:val="21"/>
-              </w:rPr>
-              <w:t xml:space="preserve">   5.6 Pengelolaan Data Skema Sertifikasi (CRUD Skema)</w:t>
-            </w:r>
-          </w:p>
-        </w:tc>
-        <w:tc>
-          <w:tcPr>
-            <w:tcW w:type="dxa" w:w="1440"/>
-            <w:tcBorders>
-              <w:top w:val="none"/>
-              <w:left w:val="none"/>
-              <w:bottom w:val="none"/>
-              <w:right w:val="none"/>
-            </w:tcBorders>
-          </w:tcPr>
-          <w:p>
-            <w:pPr>
-              <w:spacing w:before="40" w:after="40" w:line="276" w:lineRule="auto"/>
-              <w:jc w:val="right"/>
-            </w:pPr>
-            <w:r>
-              <w:rPr>
-                <w:rFonts w:ascii="Calibri" w:hAnsi="Calibri"/>
-                <w:b w:val="0"/>
-                <w:sz w:val="21"/>
-              </w:rPr>
-              <w:t>Hal. 11</w:t>
+            <w:tcW w:type="dxa" w:w="4802"/>
+          </w:tcPr>
+          <w:p>
+            <w:r>
+              <w:t>5.6 Pengelolaan Data Peserta &amp; Validasi Form Input</w:t>
+            </w:r>
+          </w:p>
+        </w:tc>
+        <w:tc>
+          <w:tcPr>
+            <w:tcW w:type="dxa" w:w="4802"/>
+          </w:tcPr>
+          <w:p>
+            <w:r>
+              <w:t>Hal. 9</w:t>
             </w:r>
           </w:p>
         </w:tc>
@@ -1343,50 +821,21 @@
       <w:tr>
         <w:tc>
           <w:tcPr>
-            <w:tcW w:type="dxa" w:w="7920"/>
-            <w:tcBorders>
-              <w:top w:val="none"/>
-              <w:left w:val="none"/>
-              <w:bottom w:val="none"/>
-              <w:right w:val="none"/>
-            </w:tcBorders>
-          </w:tcPr>
-          <w:p>
-            <w:pPr>
-              <w:spacing w:before="40" w:after="40" w:line="276" w:lineRule="auto"/>
-            </w:pPr>
-            <w:r>
-              <w:rPr>
-                <w:rFonts w:ascii="Calibri" w:hAnsi="Calibri"/>
-                <w:b w:val="0"/>
-                <w:sz w:val="21"/>
-              </w:rPr>
-              <w:t xml:space="preserve">   5.7 Implementasi Database MySQL &amp; Verifikasi Penyimpanan Data</w:t>
-            </w:r>
-          </w:p>
-        </w:tc>
-        <w:tc>
-          <w:tcPr>
-            <w:tcW w:type="dxa" w:w="1440"/>
-            <w:tcBorders>
-              <w:top w:val="none"/>
-              <w:left w:val="none"/>
-              <w:bottom w:val="none"/>
-              <w:right w:val="none"/>
-            </w:tcBorders>
-          </w:tcPr>
-          <w:p>
-            <w:pPr>
-              <w:spacing w:before="40" w:after="40" w:line="276" w:lineRule="auto"/>
-              <w:jc w:val="right"/>
-            </w:pPr>
-            <w:r>
-              <w:rPr>
-                <w:rFonts w:ascii="Calibri" w:hAnsi="Calibri"/>
-                <w:b w:val="0"/>
-                <w:sz w:val="21"/>
-              </w:rPr>
-              <w:t>Hal. 12</w:t>
+            <w:tcW w:type="dxa" w:w="4802"/>
+          </w:tcPr>
+          <w:p>
+            <w:r>
+              <w:t>5.7 Fitur Pencarian Data Peserta &amp; Detail Data</w:t>
+            </w:r>
+          </w:p>
+        </w:tc>
+        <w:tc>
+          <w:tcPr>
+            <w:tcW w:type="dxa" w:w="4802"/>
+          </w:tcPr>
+          <w:p>
+            <w:r>
+              <w:t>Hal. 10</w:t>
             </w:r>
           </w:p>
         </w:tc>
@@ -1394,50 +843,21 @@
       <w:tr>
         <w:tc>
           <w:tcPr>
-            <w:tcW w:type="dxa" w:w="7920"/>
-            <w:tcBorders>
-              <w:top w:val="none"/>
-              <w:left w:val="none"/>
-              <w:bottom w:val="none"/>
-              <w:right w:val="none"/>
-            </w:tcBorders>
-          </w:tcPr>
-          <w:p>
-            <w:pPr>
-              <w:spacing w:before="40" w:after="40" w:line="276" w:lineRule="auto"/>
-            </w:pPr>
-            <w:r>
-              <w:rPr>
-                <w:rFonts w:ascii="Calibri" w:hAnsi="Calibri"/>
-                <w:b w:val="0"/>
-                <w:sz w:val="21"/>
-              </w:rPr>
-              <w:t xml:space="preserve">   5.8 Implementasi Backend, Query PDO, &amp; Arsitektur Kode Program</w:t>
-            </w:r>
-          </w:p>
-        </w:tc>
-        <w:tc>
-          <w:tcPr>
-            <w:tcW w:type="dxa" w:w="1440"/>
-            <w:tcBorders>
-              <w:top w:val="none"/>
-              <w:left w:val="none"/>
-              <w:bottom w:val="none"/>
-              <w:right w:val="none"/>
-            </w:tcBorders>
-          </w:tcPr>
-          <w:p>
-            <w:pPr>
-              <w:spacing w:before="40" w:after="40" w:line="276" w:lineRule="auto"/>
-              <w:jc w:val="right"/>
-            </w:pPr>
-            <w:r>
-              <w:rPr>
-                <w:rFonts w:ascii="Calibri" w:hAnsi="Calibri"/>
-                <w:b w:val="0"/>
-                <w:sz w:val="21"/>
-              </w:rPr>
-              <w:t>Hal. 13</w:t>
+            <w:tcW w:type="dxa" w:w="4802"/>
+          </w:tcPr>
+          <w:p>
+            <w:r>
+              <w:t>5.8 Fitur Ubah (Edit) dan Hapus (Delete) Data Peserta</w:t>
+            </w:r>
+          </w:p>
+        </w:tc>
+        <w:tc>
+          <w:tcPr>
+            <w:tcW w:type="dxa" w:w="4802"/>
+          </w:tcPr>
+          <w:p>
+            <w:r>
+              <w:t>Hal. 11</w:t>
             </w:r>
           </w:p>
         </w:tc>
@@ -1445,50 +865,21 @@
       <w:tr>
         <w:tc>
           <w:tcPr>
-            <w:tcW w:type="dxa" w:w="7920"/>
-            <w:tcBorders>
-              <w:top w:val="none"/>
-              <w:left w:val="none"/>
-              <w:bottom w:val="none"/>
-              <w:right w:val="none"/>
-            </w:tcBorders>
-          </w:tcPr>
-          <w:p>
-            <w:pPr>
-              <w:spacing w:before="40" w:after="40" w:line="276" w:lineRule="auto"/>
-            </w:pPr>
-            <w:r>
-              <w:rPr>
-                <w:rFonts w:ascii="Calibri" w:hAnsi="Calibri"/>
-                <w:b/>
-                <w:sz w:val="21"/>
-              </w:rPr>
-              <w:t>6. PENGUJIAN SISTEM (SESUAI DOKUMEN FR.IA.02)</w:t>
-            </w:r>
-          </w:p>
-        </w:tc>
-        <w:tc>
-          <w:tcPr>
-            <w:tcW w:type="dxa" w:w="1440"/>
-            <w:tcBorders>
-              <w:top w:val="none"/>
-              <w:left w:val="none"/>
-              <w:bottom w:val="none"/>
-              <w:right w:val="none"/>
-            </w:tcBorders>
-          </w:tcPr>
-          <w:p>
-            <w:pPr>
-              <w:spacing w:before="40" w:after="40" w:line="276" w:lineRule="auto"/>
-              <w:jc w:val="right"/>
-            </w:pPr>
-            <w:r>
-              <w:rPr>
-                <w:rFonts w:ascii="Calibri" w:hAnsi="Calibri"/>
-                <w:b/>
-                <w:sz w:val="21"/>
-              </w:rPr>
-              <w:t>Hal. 16</w:t>
+            <w:tcW w:type="dxa" w:w="4802"/>
+          </w:tcPr>
+          <w:p>
+            <w:r>
+              <w:t>5.9 Pengelolaan Data Skema Sertifikasi (CRUD Skema)</w:t>
+            </w:r>
+          </w:p>
+        </w:tc>
+        <w:tc>
+          <w:tcPr>
+            <w:tcW w:type="dxa" w:w="4802"/>
+          </w:tcPr>
+          <w:p>
+            <w:r>
+              <w:t>Hal. 12</w:t>
             </w:r>
           </w:p>
         </w:tc>
@@ -1496,50 +887,21 @@
       <w:tr>
         <w:tc>
           <w:tcPr>
-            <w:tcW w:type="dxa" w:w="7920"/>
-            <w:tcBorders>
-              <w:top w:val="none"/>
-              <w:left w:val="none"/>
-              <w:bottom w:val="none"/>
-              <w:right w:val="none"/>
-            </w:tcBorders>
-          </w:tcPr>
-          <w:p>
-            <w:pPr>
-              <w:spacing w:before="40" w:after="40" w:line="276" w:lineRule="auto"/>
-            </w:pPr>
-            <w:r>
-              <w:rPr>
-                <w:rFonts w:ascii="Calibri" w:hAnsi="Calibri"/>
-                <w:b/>
-                <w:sz w:val="21"/>
-              </w:rPr>
-              <w:t>7. KESIMPULAN</w:t>
-            </w:r>
-          </w:p>
-        </w:tc>
-        <w:tc>
-          <w:tcPr>
-            <w:tcW w:type="dxa" w:w="1440"/>
-            <w:tcBorders>
-              <w:top w:val="none"/>
-              <w:left w:val="none"/>
-              <w:bottom w:val="none"/>
-              <w:right w:val="none"/>
-            </w:tcBorders>
-          </w:tcPr>
-          <w:p>
-            <w:pPr>
-              <w:spacing w:before="40" w:after="40" w:line="276" w:lineRule="auto"/>
-              <w:jc w:val="right"/>
-            </w:pPr>
-            <w:r>
-              <w:rPr>
-                <w:rFonts w:ascii="Calibri" w:hAnsi="Calibri"/>
-                <w:b/>
-                <w:sz w:val="21"/>
-              </w:rPr>
-              <w:t>Hal. 17</w:t>
+            <w:tcW w:type="dxa" w:w="4802"/>
+          </w:tcPr>
+          <w:p>
+            <w:r>
+              <w:t>5.10 Implementasi Database MySQL &amp; Verifikasi Penyimpanan Data</w:t>
+            </w:r>
+          </w:p>
+        </w:tc>
+        <w:tc>
+          <w:tcPr>
+            <w:tcW w:type="dxa" w:w="4802"/>
+          </w:tcPr>
+          <w:p>
+            <w:r>
+              <w:t>Hal. 13</w:t>
             </w:r>
           </w:p>
         </w:tc>
@@ -1547,50 +909,87 @@
       <w:tr>
         <w:tc>
           <w:tcPr>
-            <w:tcW w:type="dxa" w:w="7920"/>
-            <w:tcBorders>
-              <w:top w:val="none"/>
-              <w:left w:val="none"/>
-              <w:bottom w:val="none"/>
-              <w:right w:val="none"/>
-            </w:tcBorders>
-          </w:tcPr>
-          <w:p>
-            <w:pPr>
-              <w:spacing w:before="40" w:after="40" w:line="276" w:lineRule="auto"/>
-            </w:pPr>
-            <w:r>
-              <w:rPr>
-                <w:rFonts w:ascii="Calibri" w:hAnsi="Calibri"/>
-                <w:b/>
-                <w:sz w:val="21"/>
-              </w:rPr>
+            <w:tcW w:type="dxa" w:w="4802"/>
+          </w:tcPr>
+          <w:p>
+            <w:r>
+              <w:t>5.11 Implementasi Backend, Query PDO, &amp; Arsitektur Kode Program</w:t>
+            </w:r>
+          </w:p>
+        </w:tc>
+        <w:tc>
+          <w:tcPr>
+            <w:tcW w:type="dxa" w:w="4802"/>
+          </w:tcPr>
+          <w:p>
+            <w:r>
+              <w:t>Hal. 14</w:t>
+            </w:r>
+          </w:p>
+        </w:tc>
+      </w:tr>
+      <w:tr>
+        <w:tc>
+          <w:tcPr>
+            <w:tcW w:type="dxa" w:w="4802"/>
+          </w:tcPr>
+          <w:p>
+            <w:r>
+              <w:t>6. PENGUJIAN SISTEM (SESUAI DOKUMEN FR.IA.02)</w:t>
+            </w:r>
+          </w:p>
+        </w:tc>
+        <w:tc>
+          <w:tcPr>
+            <w:tcW w:type="dxa" w:w="4802"/>
+          </w:tcPr>
+          <w:p>
+            <w:r>
+              <w:t>Hal. 17</w:t>
+            </w:r>
+          </w:p>
+        </w:tc>
+      </w:tr>
+      <w:tr>
+        <w:tc>
+          <w:tcPr>
+            <w:tcW w:type="dxa" w:w="4802"/>
+          </w:tcPr>
+          <w:p>
+            <w:r>
+              <w:t>7. KESIMPULAN</w:t>
+            </w:r>
+          </w:p>
+        </w:tc>
+        <w:tc>
+          <w:tcPr>
+            <w:tcW w:type="dxa" w:w="4802"/>
+          </w:tcPr>
+          <w:p>
+            <w:r>
+              <w:t>Hal. 18</w:t>
+            </w:r>
+          </w:p>
+        </w:tc>
+      </w:tr>
+      <w:tr>
+        <w:tc>
+          <w:tcPr>
+            <w:tcW w:type="dxa" w:w="4802"/>
+          </w:tcPr>
+          <w:p>
+            <w:r>
               <w:t>8. LEMBAR IDENTITAS DAN PENGESAHAN ASESMEN</w:t>
             </w:r>
           </w:p>
         </w:tc>
         <w:tc>
           <w:tcPr>
-            <w:tcW w:type="dxa" w:w="1440"/>
-            <w:tcBorders>
-              <w:top w:val="none"/>
-              <w:left w:val="none"/>
-              <w:bottom w:val="none"/>
-              <w:right w:val="none"/>
-            </w:tcBorders>
-          </w:tcPr>
-          <w:p>
-            <w:pPr>
-              <w:spacing w:before="40" w:after="40" w:line="276" w:lineRule="auto"/>
-              <w:jc w:val="right"/>
-            </w:pPr>
-            <w:r>
-              <w:rPr>
-                <w:rFonts w:ascii="Calibri" w:hAnsi="Calibri"/>
-                <w:b/>
-                <w:sz w:val="21"/>
-              </w:rPr>
-              <w:t>Hal. 17</w:t>
+            <w:tcW w:type="dxa" w:w="4802"/>
+          </w:tcPr>
+          <w:p>
+            <w:r>
+              <w:t>Hal. 18</w:t>
             </w:r>
           </w:p>
         </w:tc>
@@ -2390,7 +1789,7 @@
         <w:spacing w:after="40"/>
       </w:pPr>
       <w:r>
-        <w:t>Pengguna membuka browser dan mengakses index.php (Halaman Login).</w:t>
+        <w:t>Pengguna membuka browser dan mengakses index.php (Halaman Depan / Landing Page Selamat Datang). Pengguna dapat memilih tombol Login untuk masuk ke sistem atau tombol Register untuk pendaftaran akun peserta baru.</w:t>
       </w:r>
     </w:p>
     <w:p>
@@ -2399,7 +1798,7 @@
         <w:spacing w:after="40"/>
       </w:pPr>
       <w:r>
-        <w:t>Pengguna menginputkan Username dan Password pada form login.</w:t>
+        <w:t>Bagi calon peserta yang belum memiliki akun, pengguna dapat mengakses register.php untuk mengisi form pendaftaran akun peserta dan memilih skema sertifikasi.</w:t>
       </w:r>
     </w:p>
     <w:p>
@@ -2408,10 +1807,7 @@
         <w:spacing w:after="40"/>
       </w:pPr>
       <w:r>
-        <w:t>Sistem memproses krede</w:t>
-      </w:r>
-      <w:r>
-        <w:t>nsial melalui query aman PDO Prepared Statement ke tabel 'admin'.</w:t>
+        <w:t>Pengguna yang telah memiliki akun mengakses login.php dan menginputkan Username serta Password pada form login.</w:t>
       </w:r>
     </w:p>
     <w:p>
@@ -2420,7 +1816,7 @@
         <w:spacing w:after="40"/>
       </w:pPr>
       <w:r>
-        <w:t>Jika kredensial valid, sistem menginisialisasi sesi $_SESSION['admin'] dan mengalihkan halaman ke dashboard.php.</w:t>
+        <w:t>Sistem memproses kredensial melalui query aman PDO Prepared Statement ke tabel 'admin' dan tabel 'peserta'. Jika akun Administrator valid, sistem mengarahkan ke dashboard.php; jika akun Peserta valid, sistem mengarahkan ke dashboard_user.php.</w:t>
       </w:r>
     </w:p>
     <w:p>
@@ -2441,11 +1837,7 @@
         <w:spacing w:after="40"/>
       </w:pPr>
       <w:r>
-        <w:lastRenderedPageBreak/>
-        <w:t>Setiap halaman terproteksi (dashboard.php, peserta.php, skema.php, detail_peserta.php, edit_peserta.php) memverifikasi keberadaan sesi admin. Jika sesi tidak ditemukan, pengguna langsung diarahkan paksa kembali ke index</w:t>
-      </w:r>
-      <w:r>
-        <w:t>.php.</w:t>
+        <w:t>Setiap halaman terproteksi (dashboard.php, dashboard_user.php, peserta.php, skema.php, detail_peserta.php, edit_peserta.php) memverifikasi keberadaan sesi pengguna. Jika sesi tidak ditemukan, pengguna langsung diarahkan ke halaman login.php.</w:t>
       </w:r>
     </w:p>
     <w:p>
@@ -2509,44 +1901,27 @@
         <w:spacing w:after="120"/>
       </w:pPr>
       <w:r>
-        <w:t>Aplikasi memiliki arsitektur navigasi yang konsisten dan mudah diakses oleh administrator melalui header bar/navigasi:</w:t>
-      </w:r>
-      <w:r>
+        <w:t>Aplikasi memiliki arsitektur navigasi yang konsisten dan mudah diakses melalui antarmuka responsif:</w:t>
         <w:br/>
-        <w:t xml:space="preserve">1. Login </w:t>
-      </w:r>
-      <w:r>
-        <w:t>(index.php) -&gt; Form autentikasi administrator.</w:t>
-      </w:r>
-      <w:r>
+        <w:t>1. Landing Page (index.php) -&gt; Halaman utama ucapan selamat datang serta navigasi ke Login dan Register.</w:t>
         <w:br/>
-        <w:t>2. Dashboard (dashboard.php) -&gt; Halaman utama berisi greeting, indikator ringkasan statistik, dan shortcut menu navigasi.</w:t>
-      </w:r>
-      <w:r>
+        <w:t>2. Register (register.php) -&gt; Form pendaftaran akun peserta baru mandiri dengan pilihan skema sertifikasi.</w:t>
         <w:br/>
-        <w:t>3. Kelola Skema (skema.php) -&gt; Form input skema baru / edit skema aktif dan tabel dafta</w:t>
-      </w:r>
-      <w:r>
-        <w:t>r skema dengan aksi Edit &amp; Hapus.</w:t>
-      </w:r>
-      <w:r>
+        <w:t>3. Login (login.php) -&gt; Form autentikasi multi-role (Administrator &amp; Peserta) dengan enkapsulasi sesi.</w:t>
         <w:br/>
-        <w:t>4. Kelola Peserta (peserta.php) -&gt; Form tambah cepat data peserta, form pencarian keyword, dan tabel daftar peserta dengan tombol aksi Detail, Edit, Hapus.</w:t>
-      </w:r>
-      <w:r>
+        <w:t>4. Dashboard Admin (dashboard.php) -&gt; Halaman utama administrator berisi greeting, indikator statistik, dan navigasi menu.</w:t>
         <w:br/>
-        <w:t xml:space="preserve">5. Detail Peserta (detail_peserta.php) -&gt; Kartu informasi lengkap </w:t>
-      </w:r>
-      <w:r>
-        <w:t>rincian peserta beserta skema yang diambil (hasil JOIN relasi).</w:t>
-      </w:r>
-      <w:r>
+        <w:t>5. Dashboard Peserta (dashboard_user.php) -&gt; Halaman utama peserta menampilkan status pendaftaran, data diri, dan daftar skema.</w:t>
         <w:br/>
-        <w:t>6. Edit Peserta (edit_peserta.php) -&gt; Form perubahan data peserta terintegrasi pilihan skema dinamis.</w:t>
-      </w:r>
-      <w:r>
+        <w:t>6. Kelola Skema (skema.php) -&gt; Form input skema baru / edit skema aktif dan tabel daftar skema dengan aksi Edit &amp; Hapus.</w:t>
         <w:br/>
-        <w:t>7. Logout (logout.php) -&gt; Pembersihan session dan redirect keamanan ke login.</w:t>
+        <w:t>7. Kelola Peserta (peserta.php) -&gt; Form tambah peserta, form pencarian kata kunci, dan tabel data peserta (Detail, Edit, Hapus).</w:t>
+        <w:br/>
+        <w:t>8. Detail Peserta (detail_peserta.php) -&gt; Kartu rincian lengkap peserta beserta skema yang diambil (hasil JOIN relasi).</w:t>
+        <w:br/>
+        <w:t>9. Edit Peserta (edit_peserta.php) -&gt; Form pembaruan data peserta terintegrasi pilihan skema dinamis.</w:t>
+        <w:br/>
+        <w:t>10. Logout (logout.php) -&gt; Pembersihan session (session_destroy) dan pengalihan kembali ke beranda/login.</w:t>
       </w:r>
     </w:p>
     <w:p>
@@ -2815,37 +2190,19 @@
         </w:tc>
       </w:tr>
       <w:tr>
-        <w:trPr>
-          <w:jc w:val="center"/>
-        </w:trPr>
-        <w:tc>
-          <w:tcPr>
-            <w:tcW w:w="2592" w:type="dxa"/>
-            <w:tcMar>
-              <w:top w:w="70" w:type="dxa"/>
-              <w:left w:w="120" w:type="dxa"/>
-              <w:bottom w:w="70" w:type="dxa"/>
-              <w:right w:w="120" w:type="dxa"/>
-            </w:tcMar>
-          </w:tcPr>
-          <w:p>
-            <w:r>
-              <w:rPr>
-                <w:b/>
-              </w:rPr>
+        <w:tc>
+          <w:tcPr>
+            <w:tcW w:type="dxa" w:w="4136"/>
+          </w:tcPr>
+          <w:p>
+            <w:r>
               <w:t>koneksi.php</w:t>
             </w:r>
           </w:p>
         </w:tc>
         <w:tc>
           <w:tcPr>
-            <w:tcW w:w="6912" w:type="dxa"/>
-            <w:tcMar>
-              <w:top w:w="70" w:type="dxa"/>
-              <w:left w:w="120" w:type="dxa"/>
-              <w:bottom w:w="70" w:type="dxa"/>
-              <w:right w:w="120" w:type="dxa"/>
-            </w:tcMar>
+            <w:tcW w:type="dxa" w:w="5709"/>
           </w:tcPr>
           <w:p>
             <w:r>
@@ -2855,291 +2212,221 @@
         </w:tc>
       </w:tr>
       <w:tr>
-        <w:trPr>
-          <w:jc w:val="center"/>
-        </w:trPr>
-        <w:tc>
-          <w:tcPr>
-            <w:tcW w:w="2592" w:type="dxa"/>
-            <w:tcMar>
-              <w:top w:w="70" w:type="dxa"/>
-              <w:left w:w="120" w:type="dxa"/>
-              <w:bottom w:w="70" w:type="dxa"/>
-              <w:right w:w="120" w:type="dxa"/>
-            </w:tcMar>
-          </w:tcPr>
-          <w:p>
-            <w:r>
-              <w:rPr>
-                <w:b/>
-              </w:rPr>
+        <w:tc>
+          <w:tcPr>
+            <w:tcW w:type="dxa" w:w="4136"/>
+          </w:tcPr>
+          <w:p>
+            <w:r>
               <w:t>index.php</w:t>
             </w:r>
           </w:p>
         </w:tc>
         <w:tc>
           <w:tcPr>
-            <w:tcW w:w="6912" w:type="dxa"/>
-            <w:tcMar>
-              <w:top w:w="70" w:type="dxa"/>
-              <w:left w:w="120" w:type="dxa"/>
-              <w:bottom w:w="70" w:type="dxa"/>
-              <w:right w:w="120" w:type="dxa"/>
-            </w:tcMar>
-          </w:tcPr>
-          <w:p>
-            <w:r>
-              <w:t>Antarmuka form login admin, validasi input, dan pemrosesan autentikasi dengan Prepared Statement.</w:t>
+            <w:tcW w:type="dxa" w:w="5709"/>
+          </w:tcPr>
+          <w:p>
+            <w:r>
+              <w:t>Halaman landing page (beranda) selamat datang dengan pengenalan lembaga serta tombol navigasi Login dan Register.</w:t>
             </w:r>
           </w:p>
         </w:tc>
       </w:tr>
       <w:tr>
-        <w:trPr>
-          <w:jc w:val="center"/>
-        </w:trPr>
-        <w:tc>
-          <w:tcPr>
-            <w:tcW w:w="2592" w:type="dxa"/>
-            <w:tcMar>
-              <w:top w:w="70" w:type="dxa"/>
-              <w:left w:w="120" w:type="dxa"/>
-              <w:bottom w:w="70" w:type="dxa"/>
-              <w:right w:w="120" w:type="dxa"/>
-            </w:tcMar>
-          </w:tcPr>
-          <w:p>
-            <w:r>
-              <w:rPr>
-                <w:b/>
-              </w:rPr>
-              <w:t>dashboard.php</w:t>
-            </w:r>
-          </w:p>
-        </w:tc>
-        <w:tc>
-          <w:tcPr>
-            <w:tcW w:w="6912" w:type="dxa"/>
-            <w:tcMar>
-              <w:top w:w="70" w:type="dxa"/>
-              <w:left w:w="120" w:type="dxa"/>
-              <w:bottom w:w="70" w:type="dxa"/>
-              <w:right w:w="120" w:type="dxa"/>
-            </w:tcMar>
-          </w:tcPr>
-          <w:p>
-            <w:r>
-              <w:t>Halaman utama admin menampilkan statistik ringkasan total skema dan total peserta terdaftar.</w:t>
+        <w:tc>
+          <w:tcPr>
+            <w:tcW w:type="dxa" w:w="4136"/>
+          </w:tcPr>
+          <w:p>
+            <w:r>
+              <w:t>login.php</w:t>
+            </w:r>
+          </w:p>
+        </w:tc>
+        <w:tc>
+          <w:tcPr>
+            <w:tcW w:type="dxa" w:w="5709"/>
+          </w:tcPr>
+          <w:p>
+            <w:r>
+              <w:t>Form login multi-role (Administrator &amp; Peserta) dengan autentikasi PDO Prepared Statement dan proteksi session.</w:t>
             </w:r>
           </w:p>
         </w:tc>
       </w:tr>
       <w:tr>
-        <w:trPr>
-          <w:jc w:val="center"/>
-        </w:trPr>
-        <w:tc>
-          <w:tcPr>
-            <w:tcW w:w="2592" w:type="dxa"/>
-            <w:tcMar>
-              <w:top w:w="70" w:type="dxa"/>
-              <w:left w:w="120" w:type="dxa"/>
-              <w:bottom w:w="70" w:type="dxa"/>
-              <w:right w:w="120" w:type="dxa"/>
-            </w:tcMar>
-          </w:tcPr>
-          <w:p>
-            <w:r>
-              <w:rPr>
-                <w:b/>
-              </w:rPr>
-              <w:lastRenderedPageBreak/>
-              <w:t>peserta.php</w:t>
-            </w:r>
-          </w:p>
-        </w:tc>
-        <w:tc>
-          <w:tcPr>
-            <w:tcW w:w="6912" w:type="dxa"/>
-            <w:tcMar>
-              <w:top w:w="70" w:type="dxa"/>
-              <w:left w:w="120" w:type="dxa"/>
-              <w:bottom w:w="70" w:type="dxa"/>
-              <w:right w:w="120" w:type="dxa"/>
-            </w:tcMar>
-          </w:tcPr>
-          <w:p>
-            <w:r>
-              <w:t xml:space="preserve">Modul utama data </w:t>
-            </w:r>
-            <w:r>
-              <w:t>peserta memuat form tambah cepat, input pencarian kata kunci, dan tabel data peserta.</w:t>
+        <w:tc>
+          <w:tcPr>
+            <w:tcW w:type="dxa" w:w="4136"/>
+          </w:tcPr>
+          <w:p>
+            <w:r>
+              <w:t>register.php</w:t>
+            </w:r>
+          </w:p>
+        </w:tc>
+        <w:tc>
+          <w:tcPr>
+            <w:tcW w:type="dxa" w:w="5709"/>
+          </w:tcPr>
+          <w:p>
+            <w:r>
+              <w:t>Form pendaftaran akun peserta baru secara mandiri terintegrasi pilihan skema sertifikasi dan validasi input.</w:t>
             </w:r>
           </w:p>
         </w:tc>
       </w:tr>
       <w:tr>
-        <w:trPr>
-          <w:jc w:val="center"/>
-        </w:trPr>
-        <w:tc>
-          <w:tcPr>
-            <w:tcW w:w="2592" w:type="dxa"/>
-            <w:tcMar>
-              <w:top w:w="70" w:type="dxa"/>
-              <w:left w:w="120" w:type="dxa"/>
-              <w:bottom w:w="70" w:type="dxa"/>
-              <w:right w:w="120" w:type="dxa"/>
-            </w:tcMar>
-          </w:tcPr>
-          <w:p>
-            <w:r>
-              <w:rPr>
-                <w:b/>
-              </w:rPr>
-              <w:t>detail_peserta.php</w:t>
-            </w:r>
-          </w:p>
-        </w:tc>
-        <w:tc>
-          <w:tcPr>
-            <w:tcW w:w="6912" w:type="dxa"/>
-            <w:tcMar>
-              <w:top w:w="70" w:type="dxa"/>
-              <w:left w:w="120" w:type="dxa"/>
-              <w:bottom w:w="70" w:type="dxa"/>
-              <w:right w:w="120" w:type="dxa"/>
-            </w:tcMar>
-          </w:tcPr>
-          <w:p>
-            <w:r>
-              <w:t>Menampilkan rincian data spesifik peserta dengan query JOIN ke tabel skema berdasarkan foreign key.</w:t>
+        <w:tc>
+          <w:tcPr>
+            <w:tcW w:type="dxa" w:w="4136"/>
+          </w:tcPr>
+          <w:p>
+            <w:r>
+              <w:t>dashboard.php</w:t>
+            </w:r>
+          </w:p>
+        </w:tc>
+        <w:tc>
+          <w:tcPr>
+            <w:tcW w:type="dxa" w:w="5709"/>
+          </w:tcPr>
+          <w:p>
+            <w:r>
+              <w:t>Halaman utama administrator menampilkan indikator ringkasan statistik total skema dan total peserta terdaftar.</w:t>
             </w:r>
           </w:p>
         </w:tc>
       </w:tr>
       <w:tr>
-        <w:trPr>
-          <w:jc w:val="center"/>
-        </w:trPr>
-        <w:tc>
-          <w:tcPr>
-            <w:tcW w:w="2592" w:type="dxa"/>
-            <w:tcMar>
-              <w:top w:w="70" w:type="dxa"/>
-              <w:left w:w="120" w:type="dxa"/>
-              <w:bottom w:w="70" w:type="dxa"/>
-              <w:right w:w="120" w:type="dxa"/>
-            </w:tcMar>
-          </w:tcPr>
-          <w:p>
-            <w:r>
-              <w:rPr>
-                <w:b/>
-              </w:rPr>
-              <w:t>edit_peserta.php</w:t>
-            </w:r>
-          </w:p>
-        </w:tc>
-        <w:tc>
-          <w:tcPr>
-            <w:tcW w:w="6912" w:type="dxa"/>
-            <w:tcMar>
-              <w:top w:w="70" w:type="dxa"/>
-              <w:left w:w="120" w:type="dxa"/>
-              <w:bottom w:w="70" w:type="dxa"/>
-              <w:right w:w="120" w:type="dxa"/>
-            </w:tcMar>
-          </w:tcPr>
-          <w:p>
-            <w:r>
-              <w:t>Form pengubahan (update) data pe</w:t>
-            </w:r>
-            <w:r>
-              <w:t>serta yang sudah ada dengan dropdown pilihan skema dinamis.</w:t>
+        <w:tc>
+          <w:tcPr>
+            <w:tcW w:type="dxa" w:w="4136"/>
+          </w:tcPr>
+          <w:p>
+            <w:r>
+              <w:t>dashboard_user.php</w:t>
+            </w:r>
+          </w:p>
+        </w:tc>
+        <w:tc>
+          <w:tcPr>
+            <w:tcW w:type="dxa" w:w="5709"/>
+          </w:tcPr>
+          <w:p>
+            <w:r>
+              <w:t>Panel dashboard khusus peserta untuk melihat status data pendaftaran dan referensi skema sertifikasi.</w:t>
             </w:r>
           </w:p>
         </w:tc>
       </w:tr>
       <w:tr>
-        <w:trPr>
-          <w:jc w:val="center"/>
-        </w:trPr>
-        <w:tc>
-          <w:tcPr>
-            <w:tcW w:w="2592" w:type="dxa"/>
-            <w:tcMar>
-              <w:top w:w="70" w:type="dxa"/>
-              <w:left w:w="120" w:type="dxa"/>
-              <w:bottom w:w="70" w:type="dxa"/>
-              <w:right w:w="120" w:type="dxa"/>
-            </w:tcMar>
-          </w:tcPr>
-          <w:p>
-            <w:r>
-              <w:rPr>
-                <w:b/>
-              </w:rPr>
-              <w:t>skema.php</w:t>
-            </w:r>
-          </w:p>
-        </w:tc>
-        <w:tc>
-          <w:tcPr>
-            <w:tcW w:w="6912" w:type="dxa"/>
-            <w:tcMar>
-              <w:top w:w="70" w:type="dxa"/>
-              <w:left w:w="120" w:type="dxa"/>
-              <w:bottom w:w="70" w:type="dxa"/>
-              <w:right w:w="120" w:type="dxa"/>
-            </w:tcMar>
-          </w:tcPr>
-          <w:p>
-            <w:r>
-              <w:t>Modul CRUD master skema sertifikasi (tambah skema, tampil tabel skema, edit inline, dan hapus skema).</w:t>
+        <w:tc>
+          <w:tcPr>
+            <w:tcW w:type="dxa" w:w="4136"/>
+          </w:tcPr>
+          <w:p>
+            <w:r>
+              <w:t>peserta.php</w:t>
+            </w:r>
+          </w:p>
+        </w:tc>
+        <w:tc>
+          <w:tcPr>
+            <w:tcW w:type="dxa" w:w="5709"/>
+          </w:tcPr>
+          <w:p>
+            <w:r>
+              <w:t>Modul utama data peserta memuat form tambah cepat, input pencarian kata kunci, dan tabel data peserta.</w:t>
             </w:r>
           </w:p>
         </w:tc>
       </w:tr>
       <w:tr>
-        <w:trPr>
-          <w:jc w:val="center"/>
-        </w:trPr>
-        <w:tc>
-          <w:tcPr>
-            <w:tcW w:w="2592" w:type="dxa"/>
-            <w:tcMar>
-              <w:top w:w="70" w:type="dxa"/>
-              <w:left w:w="120" w:type="dxa"/>
-              <w:bottom w:w="70" w:type="dxa"/>
-              <w:right w:w="120" w:type="dxa"/>
-            </w:tcMar>
-          </w:tcPr>
-          <w:p>
-            <w:r>
-              <w:rPr>
-                <w:b/>
-              </w:rPr>
+        <w:tc>
+          <w:tcPr>
+            <w:tcW w:type="dxa" w:w="4136"/>
+          </w:tcPr>
+          <w:p>
+            <w:r>
+              <w:t>detail_peserta.php</w:t>
+            </w:r>
+          </w:p>
+        </w:tc>
+        <w:tc>
+          <w:tcPr>
+            <w:tcW w:type="dxa" w:w="5709"/>
+          </w:tcPr>
+          <w:p>
+            <w:r>
+              <w:t>Menampilkan rincian data spesifik peserta dengan query JOIN ke tabel skema berdasarkan foreign key.</w:t>
+            </w:r>
+          </w:p>
+        </w:tc>
+      </w:tr>
+      <w:tr>
+        <w:tc>
+          <w:tcPr>
+            <w:tcW w:type="dxa" w:w="4136"/>
+          </w:tcPr>
+          <w:p>
+            <w:r>
+              <w:t>edit_peserta.php</w:t>
+            </w:r>
+          </w:p>
+        </w:tc>
+        <w:tc>
+          <w:tcPr>
+            <w:tcW w:type="dxa" w:w="5709"/>
+          </w:tcPr>
+          <w:p>
+            <w:r>
+              <w:t>Form pengubahan (update) data peserta yang sudah ada dengan dropdown pilihan skema dinamis.</w:t>
+            </w:r>
+          </w:p>
+        </w:tc>
+      </w:tr>
+      <w:tr>
+        <w:tc>
+          <w:tcPr>
+            <w:tcW w:type="dxa" w:w="4136"/>
+          </w:tcPr>
+          <w:p>
+            <w:r>
+              <w:t>skema.php</w:t>
+            </w:r>
+          </w:p>
+        </w:tc>
+        <w:tc>
+          <w:tcPr>
+            <w:tcW w:type="dxa" w:w="5709"/>
+          </w:tcPr>
+          <w:p>
+            <w:r>
+              <w:t>Modul CRUD master skema sertifikasi (tambah skema, tampil tabel skema, edit inline, dan hapus skema).</w:t>
+            </w:r>
+          </w:p>
+        </w:tc>
+      </w:tr>
+      <w:tr>
+        <w:tc>
+          <w:tcPr>
+            <w:tcW w:type="dxa" w:w="4136"/>
+          </w:tcPr>
+          <w:p>
+            <w:r>
               <w:t>logout.php</w:t>
             </w:r>
           </w:p>
         </w:tc>
         <w:tc>
           <w:tcPr>
-            <w:tcW w:w="6912" w:type="dxa"/>
-            <w:tcMar>
-              <w:top w:w="70" w:type="dxa"/>
-              <w:left w:w="120" w:type="dxa"/>
-              <w:bottom w:w="70" w:type="dxa"/>
-              <w:right w:w="120" w:type="dxa"/>
-            </w:tcMar>
-          </w:tcPr>
-          <w:p>
-            <w:r>
-              <w:t>Skrip pemusnahan sesi (session_destroy) dan redirect pengguna ke halama</w:t>
-            </w:r>
-            <w:r>
-              <w:t>n login index.php.</w:t>
+            <w:tcW w:type="dxa" w:w="5709"/>
+          </w:tcPr>
+          <w:p>
+            <w:r>
+              <w:t>Skrip pemusnahan sesi (session_destroy) dan redirect pengguna ke halaman login/beranda.</w:t>
             </w:r>
           </w:p>
         </w:tc>
@@ -3175,35 +2462,194 @@
     </w:p>
     <w:p>
       <w:pPr>
-        <w:keepNext/>
         <w:spacing w:before="240" w:after="80"/>
-      </w:pPr>
+        <w:jc w:val="left"/>
+      </w:pPr>
+      <w:r/>
       <w:r>
         <w:rPr>
           <w:b/>
-          <w:color w:val="335588"/>
           <w:sz w:val="24"/>
         </w:rPr>
-        <w:t xml:space="preserve">5.1 </w:t>
+        <w:t>5.1 Halaman Depan / Landing Page (Selamat Datang)</w:t>
       </w:r>
+    </w:p>
+    <w:p>
+      <w:pPr>
+        <w:spacing w:before="0" w:after="120"/>
+        <w:jc w:val="left"/>
+      </w:pPr>
+      <w:r/>
+      <w:r>
+        <w:rPr>
+          <w:sz w:val="20"/>
+        </w:rPr>
+        <w:t>Halaman utama (index.php) dirancang sebagai beranda selamat datang sistem informasi sertifikasi profesi. Halaman ini menyajikan profil singkat komitmen lembaga serta menyediakan dua tombol aksi utama, yaitu tombol 'Login' untuk masuk ke sistem dan tombol 'Register' untuk pendaftaran akun peserta baru.</w:t>
+      </w:r>
+    </w:p>
+    <w:p>
+      <w:pPr>
+        <w:spacing w:before="160" w:after="60"/>
+        <w:jc w:val="center"/>
+      </w:pPr>
+      <w:r/>
+      <w:r>
+        <w:drawing>
+          <wp:inline xmlns:a="http://schemas.openxmlformats.org/drawingml/2006/main" xmlns:pic="http://schemas.openxmlformats.org/drawingml/2006/picture">
+            <wp:extent cx="4937760" cy="2300109"/>
+            <wp:docPr id="25" name="Picture 25"/>
+            <wp:cNvGraphicFramePr>
+              <a:graphicFrameLocks noChangeAspect="1"/>
+            </wp:cNvGraphicFramePr>
+            <a:graphic>
+              <a:graphicData uri="http://schemas.openxmlformats.org/drawingml/2006/picture">
+                <pic:pic>
+                  <pic:nvPicPr>
+                    <pic:cNvPr id="0" name="13_Landing_Page.png"/>
+                    <pic:cNvPicPr/>
+                  </pic:nvPicPr>
+                  <pic:blipFill>
+                    <a:blip r:embed="rId32"/>
+                    <a:stretch>
+                      <a:fillRect/>
+                    </a:stretch>
+                  </pic:blipFill>
+                  <pic:spPr>
+                    <a:xfrm>
+                      <a:off x="0" y="0"/>
+                      <a:ext cx="4937760" cy="2300109"/>
+                    </a:xfrm>
+                    <a:prstGeom prst="rect"/>
+                  </pic:spPr>
+                </pic:pic>
+              </a:graphicData>
+            </a:graphic>
+          </wp:inline>
+        </w:drawing>
+      </w:r>
+    </w:p>
+    <w:p>
+      <w:pPr>
+        <w:spacing w:before="0" w:after="240"/>
+        <w:jc w:val="center"/>
+      </w:pPr>
+      <w:r/>
+      <w:r>
+        <w:rPr>
+          <w:i/>
+          <w:sz w:val="19"/>
+        </w:rPr>
+        <w:t>Gambar 5.1: Tampilan Halaman Depan / Landing Page Selamat Datang (index.php)</w:t>
+      </w:r>
+    </w:p>
+    <w:p>
+      <w:pPr>
+        <w:spacing w:before="240" w:after="80"/>
+        <w:jc w:val="left"/>
+      </w:pPr>
+      <w:r/>
       <w:r>
         <w:rPr>
           <w:b/>
-          <w:color w:val="335588"/>
           <w:sz w:val="24"/>
         </w:rPr>
-        <w:t>Halaman Login &amp; Proteksi Keamanan Autentikasi</w:t>
+        <w:t>5.2 Halaman Registrasi Akun Peserta Baru</w:t>
       </w:r>
     </w:p>
     <w:p>
       <w:pPr>
-        <w:spacing w:after="120"/>
-      </w:pPr>
+        <w:spacing w:before="0" w:after="120"/>
+        <w:jc w:val="left"/>
+      </w:pPr>
+      <w:r/>
       <w:r>
-        <w:t>Antarmuka login dirancang minimalis dan ergonomis menggunakan Bootstrap 5 card. Backend menerapkan verifikasi kredensial melalui query PDO Prepared Statement pada tabel 'admin'. Sistem juga melindungi halaman i</w:t>
+        <w:rPr>
+          <w:sz w:val="20"/>
+        </w:rPr>
+        <w:t>Fitur registrasi peserta (register.php) memungkinkan calon peserta mendaftarkan akun mandiri secara praktis ke dalam sistem. Form registrasi mewajibkan pengisian nama lengkap, username unik, password, email aktif, nomor WhatsApp/telepon, serta pilihan dropdown skema sertifikasi yang terintegrasi langsung dengan database. Setelah berhasil mendaftar, pengguna secara otomatis diarahkan ke halaman login dengan notifikasi sukses.</w:t>
       </w:r>
+    </w:p>
+    <w:p>
+      <w:pPr>
+        <w:spacing w:before="160" w:after="60"/>
+        <w:jc w:val="center"/>
+      </w:pPr>
+      <w:r/>
       <w:r>
-        <w:t>nternal dari bypass URL dengan memeriksa keberadaan $_SESSION['admin'].</w:t>
+        <w:drawing>
+          <wp:inline xmlns:a="http://schemas.openxmlformats.org/drawingml/2006/main" xmlns:pic="http://schemas.openxmlformats.org/drawingml/2006/picture">
+            <wp:extent cx="4937760" cy="2579787"/>
+            <wp:docPr id="26" name="Picture 26"/>
+            <wp:cNvGraphicFramePr>
+              <a:graphicFrameLocks noChangeAspect="1"/>
+            </wp:cNvGraphicFramePr>
+            <a:graphic>
+              <a:graphicData uri="http://schemas.openxmlformats.org/drawingml/2006/picture">
+                <pic:pic>
+                  <pic:nvPicPr>
+                    <pic:cNvPr id="0" name="14_Registrasi_Peserta.png"/>
+                    <pic:cNvPicPr/>
+                  </pic:nvPicPr>
+                  <pic:blipFill>
+                    <a:blip r:embed="rId33"/>
+                    <a:stretch>
+                      <a:fillRect/>
+                    </a:stretch>
+                  </pic:blipFill>
+                  <pic:spPr>
+                    <a:xfrm>
+                      <a:off x="0" y="0"/>
+                      <a:ext cx="4937760" cy="2579787"/>
+                    </a:xfrm>
+                    <a:prstGeom prst="rect"/>
+                  </pic:spPr>
+                </pic:pic>
+              </a:graphicData>
+            </a:graphic>
+          </wp:inline>
+        </w:drawing>
+      </w:r>
+    </w:p>
+    <w:p>
+      <w:pPr>
+        <w:spacing w:before="0" w:after="240"/>
+        <w:jc w:val="center"/>
+      </w:pPr>
+      <w:r/>
+      <w:r>
+        <w:rPr>
+          <w:i/>
+          <w:sz w:val="19"/>
+        </w:rPr>
+        <w:t>Gambar 5.2: Tampilan Form Registrasi Akun Peserta Baru (register.php)</w:t>
+      </w:r>
+    </w:p>
+    <w:p>
+      <w:pPr>
+        <w:keepNext/>
+        <w:spacing w:before="240" w:after="80"/>
+        <w:jc w:val="left"/>
+      </w:pPr>
+      <w:r/>
+      <w:r>
+        <w:rPr>
+          <w:b/>
+          <w:sz w:val="24"/>
+        </w:rPr>
+        <w:t>5.3 Halaman Login Multi-Role &amp; Proteksi Keamanan Autentikasi</w:t>
+      </w:r>
+    </w:p>
+    <w:p>
+      <w:pPr>
+        <w:spacing w:after="120" w:before="0"/>
+        <w:jc w:val="left"/>
+      </w:pPr>
+      <w:r/>
+      <w:r>
+        <w:rPr>
+          <w:sz w:val="20"/>
+        </w:rPr>
+        <w:t>Antarmuka login (login.php) dirancang minimalis dan ergonomis menggunakan Bootstrap 5 card untuk melayani autentikasi multi-role (Administrator dan Peserta). Backend menerapkan verifikasi kredensial melalui query PDO Prepared Statement pada tabel 'admin' dan tabel 'peserta'. Jika login sebagai admin, sistem mengarahkan ke dashboard.php, sedangkan jika login sebagai peserta diarahkan ke dashboard_user.php. Sistem juga melindungi seluruh halaman internal dari bypass URL dengan memeriksa session aktif.</w:t>
       </w:r>
     </w:p>
     <w:p>
@@ -3255,16 +2701,16 @@
     </w:p>
     <w:p>
       <w:pPr>
-        <w:spacing w:after="240"/>
+        <w:spacing w:after="240" w:before="0"/>
         <w:jc w:val="center"/>
       </w:pPr>
+      <w:r/>
       <w:r>
         <w:rPr>
           <w:i/>
-          <w:color w:val="555555"/>
           <w:sz w:val="19"/>
         </w:rPr>
-        <w:t>Gambar 5.1: Tampilan Form Login Administrator (index.php)</w:t>
+        <w:t>Gambar 5.3: Tampilan Form Login Sistem (login.php)</w:t>
       </w:r>
     </w:p>
     <w:p>
@@ -3316,30 +2762,31 @@
     </w:p>
     <w:p>
       <w:pPr>
-        <w:spacing w:after="240"/>
+        <w:spacing w:after="240" w:before="0"/>
         <w:jc w:val="center"/>
       </w:pPr>
+      <w:r/>
       <w:r>
         <w:rPr>
           <w:i/>
-          <w:color w:val="555555"/>
           <w:sz w:val="19"/>
         </w:rPr>
-        <w:t>Gambar 5.2: Proteksi Session — Validasi dan Notifikasi Kredensial Tidak Sesuai</w:t>
+        <w:t>Gambar 5.4: Proteksi Session - Validasi dan Notifikasi Kredensial Tidak Sesuai</w:t>
       </w:r>
     </w:p>
     <w:p>
       <w:pPr>
         <w:keepNext/>
         <w:spacing w:before="240" w:after="80"/>
-      </w:pPr>
+        <w:jc w:val="left"/>
+      </w:pPr>
+      <w:r/>
       <w:r>
         <w:rPr>
           <w:b/>
-          <w:color w:val="335588"/>
           <w:sz w:val="24"/>
         </w:rPr>
-        <w:t>5.2 Tampilan Dashboard Administrator</w:t>
+        <w:t>5.4 Tampilan Dashboard Administrator</w:t>
       </w:r>
     </w:p>
     <w:p>
@@ -3403,38 +2850,113 @@
     </w:p>
     <w:p>
       <w:pPr>
-        <w:spacing w:after="240"/>
+        <w:spacing w:after="240" w:before="0"/>
         <w:jc w:val="center"/>
       </w:pPr>
+      <w:r/>
       <w:r>
         <w:rPr>
           <w:i/>
-          <w:color w:val="555555"/>
           <w:sz w:val="19"/>
         </w:rPr>
-        <w:t>Gambar 5.3: Tampilan Dashboard Administra</w:t>
+        <w:t>Gambar 5.5: Tampilan Dashboard Administrator dengan Ringkasan Statistik Data (dashboard.php)</w:t>
       </w:r>
+    </w:p>
+    <w:p>
+      <w:pPr>
+        <w:spacing w:before="240" w:after="80"/>
+        <w:jc w:val="left"/>
+      </w:pPr>
+      <w:r/>
+      <w:r>
+        <w:rPr>
+          <w:b/>
+          <w:sz w:val="24"/>
+        </w:rPr>
+        <w:t>5.5 Tampilan Dashboard Peserta (User)</w:t>
+      </w:r>
+    </w:p>
+    <w:p>
+      <w:pPr>
+        <w:spacing w:before="0" w:after="120"/>
+        <w:jc w:val="left"/>
+      </w:pPr>
+      <w:r/>
+      <w:r>
+        <w:rPr>
+          <w:sz w:val="20"/>
+        </w:rPr>
+        <w:t>Setelah peserta berhasil login ke dalam sistem, aplikasi secara otomatis menampilkan panel dashboard khusus peserta (dashboard_user.php). Pada panel ini, peserta dapat melihat sapaan personal, status verifikasi data diri (nama, email, nomor HP, dan skema sertifikasi yang dipilih), serta referensi tabel daftar seluruh skema sertifikasi yang diselenggarakan oleh lembaga.</w:t>
+      </w:r>
+    </w:p>
+    <w:p>
+      <w:pPr>
+        <w:spacing w:before="160" w:after="60"/>
+        <w:jc w:val="center"/>
+      </w:pPr>
+      <w:r/>
+      <w:r>
+        <w:drawing>
+          <wp:inline xmlns:a="http://schemas.openxmlformats.org/drawingml/2006/main" xmlns:pic="http://schemas.openxmlformats.org/drawingml/2006/picture">
+            <wp:extent cx="4937760" cy="2054185"/>
+            <wp:docPr id="27" name="Picture 27"/>
+            <wp:cNvGraphicFramePr>
+              <a:graphicFrameLocks noChangeAspect="1"/>
+            </wp:cNvGraphicFramePr>
+            <a:graphic>
+              <a:graphicData uri="http://schemas.openxmlformats.org/drawingml/2006/picture">
+                <pic:pic>
+                  <pic:nvPicPr>
+                    <pic:cNvPr id="0" name="15_Dashboard_Peserta.png"/>
+                    <pic:cNvPicPr/>
+                  </pic:nvPicPr>
+                  <pic:blipFill>
+                    <a:blip r:embed="rId34"/>
+                    <a:stretch>
+                      <a:fillRect/>
+                    </a:stretch>
+                  </pic:blipFill>
+                  <pic:spPr>
+                    <a:xfrm>
+                      <a:off x="0" y="0"/>
+                      <a:ext cx="4937760" cy="2054185"/>
+                    </a:xfrm>
+                    <a:prstGeom prst="rect"/>
+                  </pic:spPr>
+                </pic:pic>
+              </a:graphicData>
+            </a:graphic>
+          </wp:inline>
+        </w:drawing>
+      </w:r>
+    </w:p>
+    <w:p>
+      <w:pPr>
+        <w:spacing w:before="0" w:after="240"/>
+        <w:jc w:val="center"/>
+      </w:pPr>
+      <w:r/>
       <w:r>
         <w:rPr>
           <w:i/>
-          <w:color w:val="555555"/>
           <w:sz w:val="19"/>
         </w:rPr>
-        <w:t>tor dengan Ringkasan Statistik Data</w:t>
+        <w:t>Gambar 5.6: Tampilan Dashboard Peserta Sertifikasi (dashboard_user.php)</w:t>
       </w:r>
     </w:p>
     <w:p>
       <w:pPr>
         <w:keepNext/>
         <w:spacing w:before="240" w:after="80"/>
-      </w:pPr>
+        <w:jc w:val="left"/>
+      </w:pPr>
+      <w:r/>
       <w:r>
         <w:rPr>
           <w:b/>
-          <w:color w:val="335588"/>
           <w:sz w:val="24"/>
         </w:rPr>
-        <w:t>5.3 Pengelolaan Data Peserta &amp; Validasi Form Input</w:t>
+        <w:t>5.6 Pengelolaan Data Peserta &amp; Validasi Form Input</w:t>
       </w:r>
     </w:p>
     <w:p>
@@ -3497,16 +3019,16 @@
     </w:p>
     <w:p>
       <w:pPr>
-        <w:spacing w:after="240"/>
+        <w:spacing w:after="240" w:before="0"/>
         <w:jc w:val="center"/>
       </w:pPr>
+      <w:r/>
       <w:r>
         <w:rPr>
           <w:i/>
-          <w:color w:val="555555"/>
           <w:sz w:val="19"/>
         </w:rPr>
-        <w:t>Gambar 5.4: Antarmuka Halaman Data Peserta dan Form Tambah</w:t>
+        <w:t>Gambar 5.7: Antarmuka Halaman Data Peserta dan Form Tambah (peserta.php)</w:t>
       </w:r>
     </w:p>
     <w:p>
@@ -3558,16 +3080,16 @@
     </w:p>
     <w:p>
       <w:pPr>
-        <w:spacing w:after="240"/>
+        <w:spacing w:after="240" w:before="0"/>
         <w:jc w:val="center"/>
       </w:pPr>
+      <w:r/>
       <w:r>
         <w:rPr>
           <w:i/>
-          <w:color w:val="555555"/>
           <w:sz w:val="19"/>
         </w:rPr>
-        <w:t>Gambar 5.5: Pengisian Form Pendaftaran Peserta Baru dengan Pilihan Skema</w:t>
+        <w:t>Gambar 5.8: Pengisian Form Pendaftaran Peserta Baru dengan Pilihan Skema</w:t>
       </w:r>
     </w:p>
     <w:p>
@@ -3620,38 +3142,31 @@
     </w:p>
     <w:p>
       <w:pPr>
-        <w:spacing w:after="240"/>
+        <w:spacing w:after="240" w:before="0"/>
         <w:jc w:val="center"/>
       </w:pPr>
+      <w:r/>
       <w:r>
         <w:rPr>
           <w:i/>
-          <w:color w:val="555555"/>
           <w:sz w:val="19"/>
         </w:rPr>
-        <w:t>Gambar</w:t>
-      </w:r>
-      <w:r>
-        <w:rPr>
-          <w:i/>
-          <w:color w:val="555555"/>
-          <w:sz w:val="19"/>
-        </w:rPr>
-        <w:t xml:space="preserve"> 5.6: Data Peserta Berhasil Disimpan dan Tampil pada Tabel Peserta</w:t>
+        <w:t>Gambar 5.9: Data Peserta Berhasil Disimpan dan Tampil pada Tabel Peserta</w:t>
       </w:r>
     </w:p>
     <w:p>
       <w:pPr>
         <w:keepNext/>
         <w:spacing w:before="240" w:after="80"/>
-      </w:pPr>
+        <w:jc w:val="left"/>
+      </w:pPr>
+      <w:r/>
       <w:r>
         <w:rPr>
           <w:b/>
-          <w:color w:val="335588"/>
           <w:sz w:val="24"/>
         </w:rPr>
-        <w:t>5.4 Fitur Pencarian Data Peserta &amp; Detail Data</w:t>
+        <w:t>5.7 Fitur Pencarian Data Peserta &amp; Detail Data</w:t>
       </w:r>
     </w:p>
     <w:p>
@@ -3714,16 +3229,16 @@
     </w:p>
     <w:p>
       <w:pPr>
-        <w:spacing w:after="240"/>
+        <w:spacing w:after="240" w:before="0"/>
         <w:jc w:val="center"/>
       </w:pPr>
+      <w:r/>
       <w:r>
         <w:rPr>
           <w:i/>
-          <w:color w:val="555555"/>
           <w:sz w:val="19"/>
         </w:rPr>
-        <w:t>Gambar 5.7: Melakukan Pencarian Data Peserta Berdasarkan Kata Kunci</w:t>
+        <w:t>Gambar 5.10: Melakukan Pencarian Data Peserta Berdasarkan Kata Kunci</w:t>
       </w:r>
     </w:p>
     <w:p>
@@ -3775,16 +3290,16 @@
     </w:p>
     <w:p>
       <w:pPr>
-        <w:spacing w:after="240"/>
+        <w:spacing w:after="240" w:before="0"/>
         <w:jc w:val="center"/>
       </w:pPr>
+      <w:r/>
       <w:r>
         <w:rPr>
           <w:i/>
-          <w:color w:val="555555"/>
           <w:sz w:val="19"/>
         </w:rPr>
-        <w:t>Gambar 5.8: Hasil Pencarian Data Peserta Berhasil Ditampilkan Secara Terfilter</w:t>
+        <w:t>Gambar 5.11: Hasil Pencarian Data Peserta Berhasil Ditampilkan Secara Terfilter</w:t>
       </w:r>
     </w:p>
     <w:p>
@@ -3837,38 +3352,31 @@
     </w:p>
     <w:p>
       <w:pPr>
-        <w:spacing w:after="240"/>
+        <w:spacing w:after="240" w:before="0"/>
         <w:jc w:val="center"/>
       </w:pPr>
+      <w:r/>
       <w:r>
         <w:rPr>
           <w:i/>
-          <w:color w:val="555555"/>
           <w:sz w:val="19"/>
         </w:rPr>
-        <w:t xml:space="preserve">Gambar </w:t>
-      </w:r>
-      <w:r>
-        <w:rPr>
-          <w:i/>
-          <w:color w:val="555555"/>
-          <w:sz w:val="19"/>
-        </w:rPr>
-        <w:t>5.9: Tampilan Halaman Detail Peserta dengan Relasi Skema (detail_peserta.php)</w:t>
+        <w:t>Gambar 5.12: Tampilan Halaman Detail Peserta dengan Relasi Skema (detail_peserta.php)</w:t>
       </w:r>
     </w:p>
     <w:p>
       <w:pPr>
         <w:keepNext/>
         <w:spacing w:before="240" w:after="80"/>
-      </w:pPr>
+        <w:jc w:val="left"/>
+      </w:pPr>
+      <w:r/>
       <w:r>
         <w:rPr>
           <w:b/>
-          <w:color w:val="335588"/>
           <w:sz w:val="24"/>
         </w:rPr>
-        <w:t>5.5 Fitur Ubah (Edit) dan Hapus (Delete) Data Peserta</w:t>
+        <w:t>5.8 Fitur Ubah (Edit) dan Hapus (Delete) Data Peserta</w:t>
       </w:r>
     </w:p>
     <w:p>
@@ -3931,16 +3439,16 @@
     </w:p>
     <w:p>
       <w:pPr>
-        <w:spacing w:after="240"/>
+        <w:spacing w:after="240" w:before="0"/>
         <w:jc w:val="center"/>
       </w:pPr>
+      <w:r/>
       <w:r>
         <w:rPr>
           <w:i/>
-          <w:color w:val="555555"/>
           <w:sz w:val="19"/>
         </w:rPr>
-        <w:t>Gambar 5.10: Form Edit Data Peserta Sertifikasi</w:t>
+        <w:t>Gambar 5.13: Form Edit Data Peserta Sertifikasi (edit_peserta.php)</w:t>
       </w:r>
     </w:p>
     <w:p>
@@ -3992,31 +3500,31 @@
     </w:p>
     <w:p>
       <w:pPr>
-        <w:spacing w:after="240"/>
+        <w:spacing w:after="240" w:before="0"/>
         <w:jc w:val="center"/>
       </w:pPr>
+      <w:r/>
       <w:r>
         <w:rPr>
           <w:i/>
-          <w:color w:val="555555"/>
           <w:sz w:val="19"/>
         </w:rPr>
-        <w:t>Gambar 5.11: Konfirmasi Penghapusan Data Peserta</w:t>
+        <w:t>Gambar 5.14: Konfirmasi Penghapusan Data Peserta</w:t>
       </w:r>
     </w:p>
     <w:p>
       <w:pPr>
         <w:keepNext/>
         <w:spacing w:before="240" w:after="80"/>
-      </w:pPr>
+        <w:jc w:val="left"/>
+      </w:pPr>
+      <w:r/>
       <w:r>
         <w:rPr>
           <w:b/>
-          <w:color w:val="335588"/>
           <w:sz w:val="24"/>
         </w:rPr>
-        <w:lastRenderedPageBreak/>
-        <w:t>5.6 Pengelolaan Data Skema Sertifikasi (CRUD Skema)</w:t>
+        <w:t>5.9 Pengelolaan Data Skema Sertifikasi (CRUD Skema)</w:t>
       </w:r>
     </w:p>
     <w:p>
@@ -4079,24 +3587,16 @@
     </w:p>
     <w:p>
       <w:pPr>
-        <w:spacing w:after="240"/>
+        <w:spacing w:after="240" w:before="0"/>
         <w:jc w:val="center"/>
       </w:pPr>
+      <w:r/>
       <w:r>
         <w:rPr>
           <w:i/>
-          <w:color w:val="555555"/>
           <w:sz w:val="19"/>
         </w:rPr>
-        <w:t>Gambar 5.12: Tambah Data Skema Ser</w:t>
-      </w:r>
-      <w:r>
-        <w:rPr>
-          <w:i/>
-          <w:color w:val="555555"/>
-          <w:sz w:val="19"/>
-        </w:rPr>
-        <w:t>tifikasi Baru</w:t>
+        <w:t>Gambar 5.15: Tambah Data Skema Sertifikasi Baru (skema.php)</w:t>
       </w:r>
     </w:p>
     <w:p>
@@ -4148,16 +3648,16 @@
     </w:p>
     <w:p>
       <w:pPr>
-        <w:spacing w:after="240"/>
+        <w:spacing w:after="240" w:before="0"/>
         <w:jc w:val="center"/>
       </w:pPr>
+      <w:r/>
       <w:r>
         <w:rPr>
           <w:i/>
-          <w:color w:val="555555"/>
           <w:sz w:val="19"/>
         </w:rPr>
-        <w:t>Gambar 5.13: Data Skema Berhasil Tersimpan pada Tabel Skema</w:t>
+        <w:t>Gambar 5.16: Data Skema Berhasil Tersimpan pada Tabel Skema</w:t>
       </w:r>
     </w:p>
     <w:p>
@@ -4209,16 +3709,16 @@
     </w:p>
     <w:p>
       <w:pPr>
-        <w:spacing w:after="240"/>
+        <w:spacing w:after="240" w:before="0"/>
         <w:jc w:val="center"/>
       </w:pPr>
+      <w:r/>
       <w:r>
         <w:rPr>
           <w:i/>
-          <w:color w:val="555555"/>
           <w:sz w:val="19"/>
         </w:rPr>
-        <w:t>Gambar 5.14: Form Mode Edit Data Skema Sertifikasi</w:t>
+        <w:t>Gambar 5.17: Form Mode Edit Data Skema Sertifikasi</w:t>
       </w:r>
     </w:p>
     <w:p>
@@ -4271,30 +3771,31 @@
     </w:p>
     <w:p>
       <w:pPr>
-        <w:spacing w:after="240"/>
+        <w:spacing w:after="240" w:before="0"/>
         <w:jc w:val="center"/>
       </w:pPr>
+      <w:r/>
       <w:r>
         <w:rPr>
           <w:i/>
-          <w:color w:val="555555"/>
           <w:sz w:val="19"/>
         </w:rPr>
-        <w:t>Gambar 5.15: Konfirmasi Penghapusan Data Skema Sertifikasi</w:t>
+        <w:t>Gambar 5.18: Konfirmasi Penghapusan Data Skema Sertifikasi</w:t>
       </w:r>
     </w:p>
     <w:p>
       <w:pPr>
         <w:keepNext/>
         <w:spacing w:before="240" w:after="80"/>
-      </w:pPr>
+        <w:jc w:val="left"/>
+      </w:pPr>
+      <w:r/>
       <w:r>
         <w:rPr>
           <w:b/>
-          <w:color w:val="335588"/>
           <w:sz w:val="24"/>
         </w:rPr>
-        <w:t>5.7 Implementasi Database MySQL &amp; Verifikasi Penyimpanan Data</w:t>
+        <w:t>5.10 Implementasi Database MySQL &amp; Verifikasi Penyimpanan Data</w:t>
       </w:r>
     </w:p>
     <w:p>
@@ -4357,16 +3858,16 @@
     </w:p>
     <w:p>
       <w:pPr>
-        <w:spacing w:after="240"/>
+        <w:spacing w:after="240" w:before="0"/>
         <w:jc w:val="center"/>
       </w:pPr>
+      <w:r/>
       <w:r>
         <w:rPr>
           <w:i/>
-          <w:color w:val="555555"/>
           <w:sz w:val="19"/>
         </w:rPr>
-        <w:t>Gambar 5.16: Record Data Akun Administrator pada Tabel 'admin'</w:t>
+        <w:t>Gambar 5.19: Record Data Akun Administrator pada Tabel 'admin'</w:t>
       </w:r>
     </w:p>
     <w:p>
@@ -4419,24 +3920,16 @@
     </w:p>
     <w:p>
       <w:pPr>
-        <w:spacing w:after="240"/>
+        <w:spacing w:after="240" w:before="0"/>
         <w:jc w:val="center"/>
       </w:pPr>
+      <w:r/>
       <w:r>
         <w:rPr>
           <w:i/>
-          <w:color w:val="555555"/>
           <w:sz w:val="19"/>
         </w:rPr>
-        <w:t>Gambar 5.17: Record Master Data</w:t>
-      </w:r>
-      <w:r>
-        <w:rPr>
-          <w:i/>
-          <w:color w:val="555555"/>
-          <w:sz w:val="19"/>
-        </w:rPr>
-        <w:t xml:space="preserve"> Skema Sertifikasi pada Tabel 'skema'</w:t>
+        <w:t>Gambar 5.20: Record Master Data Skema Sertifikasi pada Tabel 'skema'</w:t>
       </w:r>
     </w:p>
     <w:p>
@@ -4488,30 +3981,31 @@
     </w:p>
     <w:p>
       <w:pPr>
-        <w:spacing w:after="240"/>
+        <w:spacing w:after="240" w:before="0"/>
         <w:jc w:val="center"/>
       </w:pPr>
+      <w:r/>
       <w:r>
         <w:rPr>
           <w:i/>
-          <w:color w:val="555555"/>
           <w:sz w:val="19"/>
         </w:rPr>
-        <w:t>Gambar 5.18: Record Data Peserta dengan Relasi Foreign Key 'id_skema' pada Tabel 'peserta'</w:t>
+        <w:t>Gambar 5.21: Record Data Peserta dengan Relasi Foreign Key 'id_skema' pada Tabel 'peserta'</w:t>
       </w:r>
     </w:p>
     <w:p>
       <w:pPr>
         <w:keepNext/>
         <w:spacing w:before="240" w:after="80"/>
-      </w:pPr>
+        <w:jc w:val="left"/>
+      </w:pPr>
+      <w:r/>
       <w:r>
         <w:rPr>
           <w:b/>
-          <w:color w:val="335588"/>
           <w:sz w:val="24"/>
         </w:rPr>
-        <w:t>5.8 Implementasi Backend, Query PDO, &amp; Arsitektur Kode Program</w:t>
+        <w:t>5.11 Implementasi Backend, Query PDO, &amp; Arsitektur Kode Program</w:t>
       </w:r>
     </w:p>
     <w:p>
@@ -4575,16 +4069,16 @@
     </w:p>
     <w:p>
       <w:pPr>
-        <w:spacing w:after="240"/>
+        <w:spacing w:after="240" w:before="0"/>
         <w:jc w:val="center"/>
       </w:pPr>
+      <w:r/>
       <w:r>
         <w:rPr>
           <w:i/>
-          <w:color w:val="555555"/>
           <w:sz w:val="19"/>
         </w:rPr>
-        <w:t>Gambar 5.19: Kode Koneksi Database PDO dengan Penanganan Eksepsi (koneksi.php)</w:t>
+        <w:t>Gambar 5.22: Kode Koneksi Database PDO dengan Penanganan Eksepsi (koneksi.php)</w:t>
       </w:r>
     </w:p>
     <w:p>
@@ -4636,24 +4130,16 @@
     </w:p>
     <w:p>
       <w:pPr>
-        <w:spacing w:after="240"/>
+        <w:spacing w:after="240" w:before="0"/>
         <w:jc w:val="center"/>
       </w:pPr>
+      <w:r/>
       <w:r>
         <w:rPr>
           <w:i/>
-          <w:color w:val="555555"/>
           <w:sz w:val="19"/>
         </w:rPr>
-        <w:t xml:space="preserve">Gambar 5.20: Logika Backend Tambah &amp; Hapus </w:t>
-      </w:r>
-      <w:r>
-        <w:rPr>
-          <w:i/>
-          <w:color w:val="555555"/>
-          <w:sz w:val="19"/>
-        </w:rPr>
-        <w:t>Peserta Menggunakan Prepared Statement (peserta.php)</w:t>
+        <w:t>Gambar 5.23: Logika Backend Tambah &amp; Hapus Peserta Menggunakan Prepared Statement (peserta.php)</w:t>
       </w:r>
     </w:p>
     <w:p>
@@ -4705,16 +4191,16 @@
     </w:p>
     <w:p>
       <w:pPr>
-        <w:spacing w:after="240"/>
+        <w:spacing w:after="240" w:before="0"/>
         <w:jc w:val="center"/>
       </w:pPr>
+      <w:r/>
       <w:r>
         <w:rPr>
           <w:i/>
-          <w:color w:val="555555"/>
           <w:sz w:val="19"/>
         </w:rPr>
-        <w:t>Gambar 5.21: Logika Backend Update Data Peserta dengan Parameter Binding (edit_peserta.php)</w:t>
+        <w:t>Gambar 5.24: Logika Backend Update Data Peserta dengan Parameter Binding (edit_peserta.php)</w:t>
       </w:r>
     </w:p>
     <w:p>
@@ -4767,16 +4253,16 @@
     </w:p>
     <w:p>
       <w:pPr>
-        <w:spacing w:after="240"/>
+        <w:spacing w:after="240" w:before="0"/>
         <w:jc w:val="center"/>
       </w:pPr>
+      <w:r/>
       <w:r>
         <w:rPr>
           <w:i/>
-          <w:color w:val="555555"/>
           <w:sz w:val="19"/>
         </w:rPr>
-        <w:t>Gambar 5.22: Struktur File dan Modularitas Direktori Kerja di VS Code</w:t>
+        <w:t>Gambar 5.25: Struktur File dan Modularitas Direktori Kerja di VS Code</w:t>
       </w:r>
     </w:p>
     <w:p>
@@ -6124,6 +5610,130 @@
                 <w:b/>
                 <w:color w:val="008800"/>
               </w:rPr>
+              <w:t>VALID</w:t>
+            </w:r>
+          </w:p>
+        </w:tc>
+      </w:tr>
+      <w:tr>
+        <w:tc>
+          <w:tcPr>
+            <w:tcW w:type="dxa" w:w="1072"/>
+          </w:tcPr>
+          <w:p>
+            <w:r>
+              <w:t>11</w:t>
+            </w:r>
+          </w:p>
+        </w:tc>
+        <w:tc>
+          <w:tcPr>
+            <w:tcW w:type="dxa" w:w="1821"/>
+          </w:tcPr>
+          <w:p>
+            <w:r>
+              <w:t>Registrasi Peserta</w:t>
+            </w:r>
+          </w:p>
+        </w:tc>
+        <w:tc>
+          <w:tcPr>
+            <w:tcW w:type="dxa" w:w="2097"/>
+          </w:tcPr>
+          <w:p>
+            <w:r>
+              <w:t>Mengisi form pendaftaran akun baru dengan data lengkap &amp; memilih skema</w:t>
+            </w:r>
+          </w:p>
+        </w:tc>
+        <w:tc>
+          <w:tcPr>
+            <w:tcW w:type="dxa" w:w="1663"/>
+          </w:tcPr>
+          <w:p>
+            <w:r>
+              <w:t>Akun tersimpan di tabel peserta dan dialihkan ke form login</w:t>
+            </w:r>
+          </w:p>
+        </w:tc>
+        <w:tc>
+          <w:tcPr>
+            <w:tcW w:type="dxa" w:w="1937"/>
+          </w:tcPr>
+          <w:p>
+            <w:r>
+              <w:t>Pendaftaran berhasil, notifikasi sukses tampil di login.php</w:t>
+            </w:r>
+          </w:p>
+        </w:tc>
+        <w:tc>
+          <w:tcPr>
+            <w:tcW w:type="dxa" w:w="1215"/>
+          </w:tcPr>
+          <w:p>
+            <w:r>
+              <w:t>VALID</w:t>
+            </w:r>
+          </w:p>
+        </w:tc>
+      </w:tr>
+      <w:tr>
+        <w:tc>
+          <w:tcPr>
+            <w:tcW w:type="dxa" w:w="1072"/>
+          </w:tcPr>
+          <w:p>
+            <w:r>
+              <w:t>12</w:t>
+            </w:r>
+          </w:p>
+        </w:tc>
+        <w:tc>
+          <w:tcPr>
+            <w:tcW w:type="dxa" w:w="1821"/>
+          </w:tcPr>
+          <w:p>
+            <w:r>
+              <w:t>Dashboard Peserta</w:t>
+            </w:r>
+          </w:p>
+        </w:tc>
+        <w:tc>
+          <w:tcPr>
+            <w:tcW w:type="dxa" w:w="2097"/>
+          </w:tcPr>
+          <w:p>
+            <w:r>
+              <w:t>Peserta login dengan akun yang terdaftar</w:t>
+            </w:r>
+          </w:p>
+        </w:tc>
+        <w:tc>
+          <w:tcPr>
+            <w:tcW w:type="dxa" w:w="1663"/>
+          </w:tcPr>
+          <w:p>
+            <w:r>
+              <w:t>Masuk ke dashboard_user.php menampilkan profil dan status</w:t>
+            </w:r>
+          </w:p>
+        </w:tc>
+        <w:tc>
+          <w:tcPr>
+            <w:tcW w:type="dxa" w:w="1937"/>
+          </w:tcPr>
+          <w:p>
+            <w:r>
+              <w:t>Tampil sambutan nama peserta, status terdaftar, dan daftar skema</w:t>
+            </w:r>
+          </w:p>
+        </w:tc>
+        <w:tc>
+          <w:tcPr>
+            <w:tcW w:type="dxa" w:w="1215"/>
+          </w:tcPr>
+          <w:p>
+            <w:r>
               <w:t>VALID</w:t>
             </w:r>
           </w:p>

</xml_diff>